<commit_message>
feat: implement Petrobras template for SCAC document
Create DOCX with header, system description, use cases, and FAQ
</commit_message>
<xml_diff>
--- a/public/SCAC-Casos-de-Uso.docx
+++ b/public/SCAC-Casos-de-Uso.docx
@@ -4,45 +4,323 @@
   <w:body>
     <w:p>
       <w:pPr>
-        <w:pStyle w:val="Title"/>
-        <w:spacing w:after="200"/>
-        <w:jc w:val="center"/>
-      </w:pPr>
-      <w:r>
-        <w:t xml:space="preserve">SCAC - Sistema de Compartilhamento de Arquivos Confidenciais</w:t>
-      </w:r>
-    </w:p>
-    <w:p>
-      <w:pPr>
-        <w:pStyle w:val="Heading1"/>
-        <w:spacing w:after="400"/>
-        <w:jc w:val="center"/>
-      </w:pPr>
-      <w:r>
-        <w:t xml:space="preserve">Documento de Casos de Uso</w:t>
-      </w:r>
-    </w:p>
-    <w:p>
-      <w:pPr>
-        <w:pStyle w:val="Heading1"/>
-        <w:spacing w:after="200" w:before="400"/>
-      </w:pPr>
-      <w:r>
-        <w:t xml:space="preserve">1. Usuário Interno</w:t>
-      </w:r>
-    </w:p>
-    <w:p>
-      <w:pPr>
-        <w:spacing w:after="200"/>
+        <w:spacing w:after="300"/>
       </w:pPr>
       <w:r>
         <w:rPr>
+          <w:rFonts w:ascii="Calibri" w:cs="Calibri" w:eastAsia="Calibri" w:hAnsi="Calibri"/>
           <w:b/>
           <w:bCs/>
+          <w:color w:val="007932"/>
+          <w:sz w:val="36"/>
+          <w:szCs w:val="36"/>
+        </w:rPr>
+        <w:t xml:space="preserve">PETROBRAS</w:t>
+      </w:r>
+    </w:p>
+    <w:p>
+      <w:pPr>
+        <w:spacing w:after="300"/>
+      </w:pPr>
+      <w:r>
+        <w:rPr>
+          <w:rFonts w:ascii="Calibri" w:cs="Calibri" w:eastAsia="Calibri" w:hAnsi="Calibri"/>
+          <w:b/>
+          <w:bCs/>
+          <w:color w:val="0b253e"/>
+          <w:sz w:val="36"/>
+          <w:szCs w:val="36"/>
+        </w:rPr>
+        <w:t xml:space="preserve">SCAC - Solução de Compartilhamento de Arquivos Confidenciais</w:t>
+      </w:r>
+    </w:p>
+    <w:p>
+      <w:pPr>
+        <w:spacing w:after="80"/>
+      </w:pPr>
+      <w:r>
+        <w:rPr>
+          <w:rFonts w:ascii="Calibri" w:cs="Calibri" w:eastAsia="Calibri" w:hAnsi="Calibri"/>
+          <w:b/>
+          <w:bCs/>
+          <w:color w:val="333333"/>
+          <w:sz w:val="22"/>
+          <w:szCs w:val="22"/>
+        </w:rPr>
+        <w:t xml:space="preserve">Código: </w:t>
+      </w:r>
+      <w:r>
+        <w:rPr>
+          <w:rFonts w:ascii="Calibri" w:cs="Calibri" w:eastAsia="Calibri" w:hAnsi="Calibri"/>
+          <w:color w:val="333333"/>
+          <w:sz w:val="22"/>
+          <w:szCs w:val="22"/>
+        </w:rPr>
+        <w:t xml:space="preserve">12022</w:t>
+      </w:r>
+    </w:p>
+    <w:p>
+      <w:pPr>
+        <w:spacing w:after="80"/>
+      </w:pPr>
+      <w:r>
+        <w:rPr>
+          <w:rFonts w:ascii="Calibri" w:cs="Calibri" w:eastAsia="Calibri" w:hAnsi="Calibri"/>
+          <w:b/>
+          <w:bCs/>
+          <w:color w:val="333333"/>
+          <w:sz w:val="22"/>
+          <w:szCs w:val="22"/>
+        </w:rPr>
+        <w:t xml:space="preserve">Sigla: </w:t>
+      </w:r>
+      <w:r>
+        <w:rPr>
+          <w:rFonts w:ascii="Calibri" w:cs="Calibri" w:eastAsia="Calibri" w:hAnsi="Calibri"/>
+          <w:color w:val="333333"/>
+          <w:sz w:val="22"/>
+          <w:szCs w:val="22"/>
+        </w:rPr>
+        <w:t xml:space="preserve">SCAC / SI-CSA</w:t>
+      </w:r>
+    </w:p>
+    <w:p>
+      <w:pPr>
+        <w:spacing w:after="80"/>
+      </w:pPr>
+      <w:r>
+        <w:rPr>
+          <w:rFonts w:ascii="Calibri" w:cs="Calibri" w:eastAsia="Calibri" w:hAnsi="Calibri"/>
+          <w:b/>
+          <w:bCs/>
+          <w:color w:val="333333"/>
+          <w:sz w:val="22"/>
+          <w:szCs w:val="22"/>
+        </w:rPr>
+        <w:t xml:space="preserve">Líder Técnico: </w:t>
+      </w:r>
+      <w:r>
+        <w:rPr>
+          <w:rFonts w:ascii="Calibri" w:cs="Calibri" w:eastAsia="Calibri" w:hAnsi="Calibri"/>
+          <w:color w:val="333333"/>
+          <w:sz w:val="22"/>
+          <w:szCs w:val="22"/>
+        </w:rPr>
+        <w:t xml:space="preserve">Isaac Henriques Francisco Pereira</w:t>
+      </w:r>
+    </w:p>
+    <w:p>
+      <w:pPr>
+        <w:spacing w:after="80"/>
+      </w:pPr>
+      <w:r>
+        <w:rPr>
+          <w:rFonts w:ascii="Calibri" w:cs="Calibri" w:eastAsia="Calibri" w:hAnsi="Calibri"/>
+          <w:b/>
+          <w:bCs/>
+          <w:color w:val="333333"/>
+          <w:sz w:val="22"/>
+          <w:szCs w:val="22"/>
+        </w:rPr>
+        <w:t xml:space="preserve">Área Responsável: </w:t>
+      </w:r>
+      <w:r>
+        <w:rPr>
+          <w:rFonts w:ascii="Calibri" w:cs="Calibri" w:eastAsia="Calibri" w:hAnsi="Calibri"/>
+          <w:color w:val="333333"/>
+          <w:sz w:val="22"/>
+          <w:szCs w:val="22"/>
+        </w:rPr>
+        <w:t xml:space="preserve">TIC/ARQTIC/ARQNUV</w:t>
+      </w:r>
+    </w:p>
+    <w:p>
+      <w:pPr>
+        <w:spacing w:after="80"/>
+      </w:pPr>
+      <w:r>
+        <w:rPr>
+          <w:rFonts w:ascii="Calibri" w:cs="Calibri" w:eastAsia="Calibri" w:hAnsi="Calibri"/>
+          <w:b/>
+          <w:bCs/>
+          <w:color w:val="333333"/>
+          <w:sz w:val="22"/>
+          <w:szCs w:val="22"/>
+        </w:rPr>
+        <w:t xml:space="preserve">PO / Cliente: </w:t>
+      </w:r>
+      <w:r>
+        <w:rPr>
+          <w:rFonts w:ascii="Calibri" w:cs="Calibri" w:eastAsia="Calibri" w:hAnsi="Calibri"/>
+          <w:color w:val="333333"/>
+          <w:sz w:val="22"/>
+          <w:szCs w:val="22"/>
+        </w:rPr>
+        <w:t xml:space="preserve">Wagner Gaspar Brazil</w:t>
+      </w:r>
+    </w:p>
+    <w:p>
+      <w:pPr>
+        <w:spacing w:after="80"/>
+      </w:pPr>
+      <w:r>
+        <w:rPr>
+          <w:rFonts w:ascii="Calibri" w:cs="Calibri" w:eastAsia="Calibri" w:hAnsi="Calibri"/>
+          <w:b/>
+          <w:bCs/>
+          <w:color w:val="333333"/>
+          <w:sz w:val="22"/>
+          <w:szCs w:val="22"/>
+        </w:rPr>
+        <w:t xml:space="preserve">Área Cliente: </w:t>
+      </w:r>
+      <w:r>
+        <w:rPr>
+          <w:rFonts w:ascii="Calibri" w:cs="Calibri" w:eastAsia="Calibri" w:hAnsi="Calibri"/>
+          <w:color w:val="333333"/>
+          <w:sz w:val="22"/>
+          <w:szCs w:val="22"/>
+        </w:rPr>
+        <w:t xml:space="preserve">SI/SDAA/SEGDA</w:t>
+      </w:r>
+    </w:p>
+    <w:p>
+      <w:pPr>
+        <w:spacing w:after="80"/>
+      </w:pPr>
+      <w:r>
+        <w:rPr>
+          <w:rFonts w:ascii="Calibri" w:cs="Calibri" w:eastAsia="Calibri" w:hAnsi="Calibri"/>
+          <w:b/>
+          <w:bCs/>
+          <w:color w:val="333333"/>
+          <w:sz w:val="22"/>
+          <w:szCs w:val="22"/>
+        </w:rPr>
+        <w:t xml:space="preserve">Tipo Infraestrutura: </w:t>
+      </w:r>
+      <w:r>
+        <w:rPr>
+          <w:rFonts w:ascii="Calibri" w:cs="Calibri" w:eastAsia="Calibri" w:hAnsi="Calibri"/>
+          <w:color w:val="333333"/>
+          <w:sz w:val="22"/>
+          <w:szCs w:val="22"/>
+        </w:rPr>
+        <w:t xml:space="preserve">Cloud AWS utilizando arquitetura containerizada por Amazon ECS</w:t>
+      </w:r>
+    </w:p>
+    <w:p>
+      <w:pPr>
+        <w:spacing w:after="400"/>
+      </w:pPr>
+    </w:p>
+    <w:p>
+      <w:pPr>
+        <w:spacing w:after="200" w:before="200"/>
+      </w:pPr>
+      <w:r>
+        <w:rPr>
+          <w:rFonts w:ascii="Calibri" w:cs="Calibri" w:eastAsia="Calibri" w:hAnsi="Calibri"/>
+          <w:b/>
+          <w:bCs/>
+          <w:color w:val="0b253e"/>
+          <w:sz w:val="28"/>
+          <w:szCs w:val="28"/>
+        </w:rPr>
+        <w:t xml:space="preserve">1. Descrição do Sistema</w:t>
+      </w:r>
+    </w:p>
+    <w:p>
+      <w:pPr>
+        <w:spacing w:after="200"/>
+      </w:pPr>
+      <w:r>
+        <w:rPr>
+          <w:rFonts w:ascii="Calibri" w:cs="Calibri" w:eastAsia="Calibri" w:hAnsi="Calibri"/>
+          <w:color w:val="333333"/>
+          <w:sz w:val="22"/>
+          <w:szCs w:val="22"/>
+        </w:rPr>
+        <w:t xml:space="preserve">O SCAC (Sistema de Compartilhamento de Arquivos Confidenciais) é uma plataforma segura para compartilhamento de arquivos confidenciais com usuários externos autorizados. A solução contempla autenticação corporativa, autorização baseada em grupos, upload de arquivos, compartilhamento seguro, fluxo de aprovação gerencial, autenticação externa via OTP, auditoria, rastreabilidade e geração de relatórios.</w:t>
+      </w:r>
+    </w:p>
+    <w:p>
+      <w:pPr>
+        <w:spacing w:after="400"/>
+      </w:pPr>
+      <w:r>
+        <w:rPr>
+          <w:rFonts w:ascii="Calibri" w:cs="Calibri" w:eastAsia="Calibri" w:hAnsi="Calibri"/>
+          <w:b/>
+          <w:bCs/>
+          <w:color w:val="333333"/>
+          <w:sz w:val="22"/>
+          <w:szCs w:val="22"/>
+        </w:rPr>
+        <w:t xml:space="preserve">Limites do escopo: </w:t>
+      </w:r>
+      <w:r>
+        <w:rPr>
+          <w:rFonts w:ascii="Calibri" w:cs="Calibri" w:eastAsia="Calibri" w:hAnsi="Calibri"/>
+          <w:color w:val="333333"/>
+          <w:sz w:val="22"/>
+          <w:szCs w:val="22"/>
+        </w:rPr>
+        <w:t xml:space="preserve">O sistema não contempla gerenciamento administrativo de usuários, gerenciamento de grupos do Entra ID, gerenciamento direto de políticas Purview e administração da infraestrutura AWS.</w:t>
+      </w:r>
+    </w:p>
+    <w:p>
+      <w:pPr>
+        <w:spacing w:after="300" w:before="200"/>
+      </w:pPr>
+      <w:r>
+        <w:rPr>
+          <w:rFonts w:ascii="Calibri" w:cs="Calibri" w:eastAsia="Calibri" w:hAnsi="Calibri"/>
+          <w:b/>
+          <w:bCs/>
+          <w:color w:val="0b253e"/>
+          <w:sz w:val="28"/>
+          <w:szCs w:val="28"/>
+        </w:rPr>
+        <w:t xml:space="preserve">2. Casos de Uso</w:t>
+      </w:r>
+    </w:p>
+    <w:p>
+      <w:pPr>
+        <w:spacing w:after="100" w:before="200"/>
+      </w:pPr>
+      <w:r>
+        <w:rPr>
+          <w:rFonts w:ascii="Calibri" w:cs="Calibri" w:eastAsia="Calibri" w:hAnsi="Calibri"/>
+          <w:b/>
+          <w:bCs/>
+          <w:color w:val="0b253e"/>
+          <w:sz w:val="26"/>
+          <w:szCs w:val="26"/>
+        </w:rPr>
+        <w:t xml:space="preserve">2.1 Usuário Interno</w:t>
+      </w:r>
+    </w:p>
+    <w:p>
+      <w:pPr>
+        <w:spacing w:after="200"/>
+      </w:pPr>
+      <w:r>
+        <w:rPr>
+          <w:rFonts w:ascii="Calibri" w:cs="Calibri" w:eastAsia="Calibri" w:hAnsi="Calibri"/>
+          <w:b/>
+          <w:bCs/>
+          <w:sz w:val="22"/>
+          <w:szCs w:val="22"/>
         </w:rPr>
         <w:t xml:space="preserve">Objetivo: </w:t>
       </w:r>
       <w:r>
+        <w:rPr>
+          <w:rFonts w:ascii="Calibri" w:cs="Calibri" w:eastAsia="Calibri" w:hAnsi="Calibri"/>
+          <w:sz w:val="22"/>
+          <w:szCs w:val="22"/>
+        </w:rPr>
         <w:t xml:space="preserve">Iniciar processos de compartilhamento de arquivos.</w:t>
       </w:r>
     </w:p>
@@ -71,6 +349,7 @@
           <w:p>
             <w:r>
               <w:rPr>
+                <w:rFonts w:ascii="Calibri" w:cs="Calibri" w:eastAsia="Calibri" w:hAnsi="Calibri"/>
                 <w:b/>
                 <w:bCs/>
                 <w:color w:val="FFFFFF"/>
@@ -89,6 +368,7 @@
           <w:p>
             <w:r>
               <w:rPr>
+                <w:rFonts w:ascii="Calibri" w:cs="Calibri" w:eastAsia="Calibri" w:hAnsi="Calibri"/>
                 <w:b/>
                 <w:bCs/>
                 <w:color w:val="FFFFFF"/>
@@ -108,9 +388,10 @@
           <w:p>
             <w:r>
               <w:rPr>
-                <w:b/>
-                <w:bCs/>
-                <w:color w:val="000000"/>
+                <w:rFonts w:ascii="Calibri" w:cs="Calibri" w:eastAsia="Calibri" w:hAnsi="Calibri"/>
+                <w:b/>
+                <w:bCs/>
+                <w:color w:val="333333"/>
                 <w:sz w:val="22"/>
                 <w:szCs w:val="22"/>
               </w:rPr>
@@ -125,9 +406,10 @@
           <w:p>
             <w:r>
               <w:rPr>
-                <w:b w:val="false"/>
-                <w:bCs w:val="false"/>
-                <w:color w:val="000000"/>
+                <w:rFonts w:ascii="Calibri" w:cs="Calibri" w:eastAsia="Calibri" w:hAnsi="Calibri"/>
+                <w:b w:val="false"/>
+                <w:bCs w:val="false"/>
+                <w:color w:val="333333"/>
                 <w:sz w:val="22"/>
                 <w:szCs w:val="22"/>
               </w:rPr>
@@ -144,9 +426,10 @@
           <w:p>
             <w:r>
               <w:rPr>
-                <w:b/>
-                <w:bCs/>
-                <w:color w:val="000000"/>
+                <w:rFonts w:ascii="Calibri" w:cs="Calibri" w:eastAsia="Calibri" w:hAnsi="Calibri"/>
+                <w:b/>
+                <w:bCs/>
+                <w:color w:val="333333"/>
                 <w:sz w:val="22"/>
                 <w:szCs w:val="22"/>
               </w:rPr>
@@ -161,9 +444,10 @@
           <w:p>
             <w:r>
               <w:rPr>
-                <w:b w:val="false"/>
-                <w:bCs w:val="false"/>
-                <w:color w:val="000000"/>
+                <w:rFonts w:ascii="Calibri" w:cs="Calibri" w:eastAsia="Calibri" w:hAnsi="Calibri"/>
+                <w:b w:val="false"/>
+                <w:bCs w:val="false"/>
+                <w:color w:val="333333"/>
                 <w:sz w:val="22"/>
                 <w:szCs w:val="22"/>
               </w:rPr>
@@ -180,9 +464,10 @@
           <w:p>
             <w:r>
               <w:rPr>
-                <w:b/>
-                <w:bCs/>
-                <w:color w:val="000000"/>
+                <w:rFonts w:ascii="Calibri" w:cs="Calibri" w:eastAsia="Calibri" w:hAnsi="Calibri"/>
+                <w:b/>
+                <w:bCs/>
+                <w:color w:val="333333"/>
                 <w:sz w:val="22"/>
                 <w:szCs w:val="22"/>
               </w:rPr>
@@ -197,9 +482,10 @@
           <w:p>
             <w:r>
               <w:rPr>
-                <w:b w:val="false"/>
-                <w:bCs w:val="false"/>
-                <w:color w:val="000000"/>
+                <w:rFonts w:ascii="Calibri" w:cs="Calibri" w:eastAsia="Calibri" w:hAnsi="Calibri"/>
+                <w:b w:val="false"/>
+                <w:bCs w:val="false"/>
+                <w:color w:val="333333"/>
                 <w:sz w:val="22"/>
                 <w:szCs w:val="22"/>
               </w:rPr>
@@ -216,9 +502,10 @@
           <w:p>
             <w:r>
               <w:rPr>
-                <w:b/>
-                <w:bCs/>
-                <w:color w:val="000000"/>
+                <w:rFonts w:ascii="Calibri" w:cs="Calibri" w:eastAsia="Calibri" w:hAnsi="Calibri"/>
+                <w:b/>
+                <w:bCs/>
+                <w:color w:val="333333"/>
                 <w:sz w:val="22"/>
                 <w:szCs w:val="22"/>
               </w:rPr>
@@ -233,9 +520,10 @@
           <w:p>
             <w:r>
               <w:rPr>
-                <w:b w:val="false"/>
-                <w:bCs w:val="false"/>
-                <w:color w:val="000000"/>
+                <w:rFonts w:ascii="Calibri" w:cs="Calibri" w:eastAsia="Calibri" w:hAnsi="Calibri"/>
+                <w:b w:val="false"/>
+                <w:bCs w:val="false"/>
+                <w:color w:val="333333"/>
                 <w:sz w:val="22"/>
                 <w:szCs w:val="22"/>
               </w:rPr>
@@ -252,9 +540,10 @@
           <w:p>
             <w:r>
               <w:rPr>
-                <w:b/>
-                <w:bCs/>
-                <w:color w:val="000000"/>
+                <w:rFonts w:ascii="Calibri" w:cs="Calibri" w:eastAsia="Calibri" w:hAnsi="Calibri"/>
+                <w:b/>
+                <w:bCs/>
+                <w:color w:val="333333"/>
                 <w:sz w:val="22"/>
                 <w:szCs w:val="22"/>
               </w:rPr>
@@ -269,9 +558,10 @@
           <w:p>
             <w:r>
               <w:rPr>
-                <w:b w:val="false"/>
-                <w:bCs w:val="false"/>
-                <w:color w:val="000000"/>
+                <w:rFonts w:ascii="Calibri" w:cs="Calibri" w:eastAsia="Calibri" w:hAnsi="Calibri"/>
+                <w:b w:val="false"/>
+                <w:bCs w:val="false"/>
+                <w:color w:val="333333"/>
                 <w:sz w:val="22"/>
                 <w:szCs w:val="22"/>
               </w:rPr>
@@ -288,9 +578,10 @@
           <w:p>
             <w:r>
               <w:rPr>
-                <w:b/>
-                <w:bCs/>
-                <w:color w:val="000000"/>
+                <w:rFonts w:ascii="Calibri" w:cs="Calibri" w:eastAsia="Calibri" w:hAnsi="Calibri"/>
+                <w:b/>
+                <w:bCs/>
+                <w:color w:val="333333"/>
                 <w:sz w:val="22"/>
                 <w:szCs w:val="22"/>
               </w:rPr>
@@ -305,9 +596,10 @@
           <w:p>
             <w:r>
               <w:rPr>
-                <w:b w:val="false"/>
-                <w:bCs w:val="false"/>
-                <w:color w:val="000000"/>
+                <w:rFonts w:ascii="Calibri" w:cs="Calibri" w:eastAsia="Calibri" w:hAnsi="Calibri"/>
+                <w:b w:val="false"/>
+                <w:bCs w:val="false"/>
+                <w:color w:val="333333"/>
                 <w:sz w:val="22"/>
                 <w:szCs w:val="22"/>
               </w:rPr>
@@ -347,6 +639,7 @@
           <w:p>
             <w:r>
               <w:rPr>
+                <w:rFonts w:ascii="Calibri" w:cs="Calibri" w:eastAsia="Calibri" w:hAnsi="Calibri"/>
                 <w:b/>
                 <w:bCs/>
                 <w:color w:val="FFFFFF"/>
@@ -365,6 +658,7 @@
           <w:p>
             <w:r>
               <w:rPr>
+                <w:rFonts w:ascii="Calibri" w:cs="Calibri" w:eastAsia="Calibri" w:hAnsi="Calibri"/>
                 <w:b/>
                 <w:bCs/>
                 <w:color w:val="FFFFFF"/>
@@ -384,9 +678,10 @@
           <w:p>
             <w:r>
               <w:rPr>
-                <w:b/>
-                <w:bCs/>
-                <w:color w:val="000000"/>
+                <w:rFonts w:ascii="Calibri" w:cs="Calibri" w:eastAsia="Calibri" w:hAnsi="Calibri"/>
+                <w:b/>
+                <w:bCs/>
+                <w:color w:val="333333"/>
                 <w:sz w:val="22"/>
                 <w:szCs w:val="22"/>
               </w:rPr>
@@ -401,9 +696,10 @@
           <w:p>
             <w:r>
               <w:rPr>
-                <w:b w:val="false"/>
-                <w:bCs w:val="false"/>
-                <w:color w:val="000000"/>
+                <w:rFonts w:ascii="Calibri" w:cs="Calibri" w:eastAsia="Calibri" w:hAnsi="Calibri"/>
+                <w:b w:val="false"/>
+                <w:bCs w:val="false"/>
+                <w:color w:val="333333"/>
                 <w:sz w:val="22"/>
                 <w:szCs w:val="22"/>
               </w:rPr>
@@ -420,9 +716,10 @@
           <w:p>
             <w:r>
               <w:rPr>
-                <w:b/>
-                <w:bCs/>
-                <w:color w:val="000000"/>
+                <w:rFonts w:ascii="Calibri" w:cs="Calibri" w:eastAsia="Calibri" w:hAnsi="Calibri"/>
+                <w:b/>
+                <w:bCs/>
+                <w:color w:val="333333"/>
                 <w:sz w:val="22"/>
                 <w:szCs w:val="22"/>
               </w:rPr>
@@ -437,9 +734,10 @@
           <w:p>
             <w:r>
               <w:rPr>
-                <w:b w:val="false"/>
-                <w:bCs w:val="false"/>
-                <w:color w:val="000000"/>
+                <w:rFonts w:ascii="Calibri" w:cs="Calibri" w:eastAsia="Calibri" w:hAnsi="Calibri"/>
+                <w:b w:val="false"/>
+                <w:bCs w:val="false"/>
+                <w:color w:val="333333"/>
                 <w:sz w:val="22"/>
                 <w:szCs w:val="22"/>
               </w:rPr>
@@ -456,9 +754,10 @@
           <w:p>
             <w:r>
               <w:rPr>
-                <w:b/>
-                <w:bCs/>
-                <w:color w:val="000000"/>
+                <w:rFonts w:ascii="Calibri" w:cs="Calibri" w:eastAsia="Calibri" w:hAnsi="Calibri"/>
+                <w:b/>
+                <w:bCs/>
+                <w:color w:val="333333"/>
                 <w:sz w:val="22"/>
                 <w:szCs w:val="22"/>
               </w:rPr>
@@ -473,9 +772,10 @@
           <w:p>
             <w:r>
               <w:rPr>
-                <w:b w:val="false"/>
-                <w:bCs w:val="false"/>
-                <w:color w:val="000000"/>
+                <w:rFonts w:ascii="Calibri" w:cs="Calibri" w:eastAsia="Calibri" w:hAnsi="Calibri"/>
+                <w:b w:val="false"/>
+                <w:bCs w:val="false"/>
+                <w:color w:val="333333"/>
                 <w:sz w:val="22"/>
                 <w:szCs w:val="22"/>
               </w:rPr>
@@ -492,9 +792,10 @@
           <w:p>
             <w:r>
               <w:rPr>
-                <w:b/>
-                <w:bCs/>
-                <w:color w:val="000000"/>
+                <w:rFonts w:ascii="Calibri" w:cs="Calibri" w:eastAsia="Calibri" w:hAnsi="Calibri"/>
+                <w:b/>
+                <w:bCs/>
+                <w:color w:val="333333"/>
                 <w:sz w:val="22"/>
                 <w:szCs w:val="22"/>
               </w:rPr>
@@ -509,9 +810,10 @@
           <w:p>
             <w:r>
               <w:rPr>
-                <w:b w:val="false"/>
-                <w:bCs w:val="false"/>
-                <w:color w:val="000000"/>
+                <w:rFonts w:ascii="Calibri" w:cs="Calibri" w:eastAsia="Calibri" w:hAnsi="Calibri"/>
+                <w:b w:val="false"/>
+                <w:bCs w:val="false"/>
+                <w:color w:val="333333"/>
                 <w:sz w:val="22"/>
                 <w:szCs w:val="22"/>
               </w:rPr>
@@ -528,9 +830,10 @@
           <w:p>
             <w:r>
               <w:rPr>
-                <w:b/>
-                <w:bCs/>
-                <w:color w:val="000000"/>
+                <w:rFonts w:ascii="Calibri" w:cs="Calibri" w:eastAsia="Calibri" w:hAnsi="Calibri"/>
+                <w:b/>
+                <w:bCs/>
+                <w:color w:val="333333"/>
                 <w:sz w:val="22"/>
                 <w:szCs w:val="22"/>
               </w:rPr>
@@ -545,9 +848,10 @@
           <w:p>
             <w:r>
               <w:rPr>
-                <w:b w:val="false"/>
-                <w:bCs w:val="false"/>
-                <w:color w:val="000000"/>
+                <w:rFonts w:ascii="Calibri" w:cs="Calibri" w:eastAsia="Calibri" w:hAnsi="Calibri"/>
+                <w:b w:val="false"/>
+                <w:bCs w:val="false"/>
+                <w:color w:val="333333"/>
                 <w:sz w:val="22"/>
                 <w:szCs w:val="22"/>
               </w:rPr>
@@ -564,9 +868,10 @@
           <w:p>
             <w:r>
               <w:rPr>
-                <w:b/>
-                <w:bCs/>
-                <w:color w:val="000000"/>
+                <w:rFonts w:ascii="Calibri" w:cs="Calibri" w:eastAsia="Calibri" w:hAnsi="Calibri"/>
+                <w:b/>
+                <w:bCs/>
+                <w:color w:val="333333"/>
                 <w:sz w:val="22"/>
                 <w:szCs w:val="22"/>
               </w:rPr>
@@ -581,9 +886,10 @@
           <w:p>
             <w:r>
               <w:rPr>
-                <w:b w:val="false"/>
-                <w:bCs w:val="false"/>
-                <w:color w:val="000000"/>
+                <w:rFonts w:ascii="Calibri" w:cs="Calibri" w:eastAsia="Calibri" w:hAnsi="Calibri"/>
+                <w:b w:val="false"/>
+                <w:bCs w:val="false"/>
+                <w:color w:val="333333"/>
                 <w:sz w:val="22"/>
                 <w:szCs w:val="22"/>
               </w:rPr>
@@ -623,6 +929,7 @@
           <w:p>
             <w:r>
               <w:rPr>
+                <w:rFonts w:ascii="Calibri" w:cs="Calibri" w:eastAsia="Calibri" w:hAnsi="Calibri"/>
                 <w:b/>
                 <w:bCs/>
                 <w:color w:val="FFFFFF"/>
@@ -641,6 +948,7 @@
           <w:p>
             <w:r>
               <w:rPr>
+                <w:rFonts w:ascii="Calibri" w:cs="Calibri" w:eastAsia="Calibri" w:hAnsi="Calibri"/>
                 <w:b/>
                 <w:bCs/>
                 <w:color w:val="FFFFFF"/>
@@ -660,9 +968,10 @@
           <w:p>
             <w:r>
               <w:rPr>
-                <w:b/>
-                <w:bCs/>
-                <w:color w:val="000000"/>
+                <w:rFonts w:ascii="Calibri" w:cs="Calibri" w:eastAsia="Calibri" w:hAnsi="Calibri"/>
+                <w:b/>
+                <w:bCs/>
+                <w:color w:val="333333"/>
                 <w:sz w:val="22"/>
                 <w:szCs w:val="22"/>
               </w:rPr>
@@ -677,9 +986,10 @@
           <w:p>
             <w:r>
               <w:rPr>
-                <w:b w:val="false"/>
-                <w:bCs w:val="false"/>
-                <w:color w:val="000000"/>
+                <w:rFonts w:ascii="Calibri" w:cs="Calibri" w:eastAsia="Calibri" w:hAnsi="Calibri"/>
+                <w:b w:val="false"/>
+                <w:bCs w:val="false"/>
+                <w:color w:val="333333"/>
                 <w:sz w:val="22"/>
                 <w:szCs w:val="22"/>
               </w:rPr>
@@ -696,9 +1006,10 @@
           <w:p>
             <w:r>
               <w:rPr>
-                <w:b/>
-                <w:bCs/>
-                <w:color w:val="000000"/>
+                <w:rFonts w:ascii="Calibri" w:cs="Calibri" w:eastAsia="Calibri" w:hAnsi="Calibri"/>
+                <w:b/>
+                <w:bCs/>
+                <w:color w:val="333333"/>
                 <w:sz w:val="22"/>
                 <w:szCs w:val="22"/>
               </w:rPr>
@@ -713,9 +1024,10 @@
           <w:p>
             <w:r>
               <w:rPr>
-                <w:b w:val="false"/>
-                <w:bCs w:val="false"/>
-                <w:color w:val="000000"/>
+                <w:rFonts w:ascii="Calibri" w:cs="Calibri" w:eastAsia="Calibri" w:hAnsi="Calibri"/>
+                <w:b w:val="false"/>
+                <w:bCs w:val="false"/>
+                <w:color w:val="333333"/>
                 <w:sz w:val="22"/>
                 <w:szCs w:val="22"/>
               </w:rPr>
@@ -732,9 +1044,10 @@
           <w:p>
             <w:r>
               <w:rPr>
-                <w:b/>
-                <w:bCs/>
-                <w:color w:val="000000"/>
+                <w:rFonts w:ascii="Calibri" w:cs="Calibri" w:eastAsia="Calibri" w:hAnsi="Calibri"/>
+                <w:b/>
+                <w:bCs/>
+                <w:color w:val="333333"/>
                 <w:sz w:val="22"/>
                 <w:szCs w:val="22"/>
               </w:rPr>
@@ -749,9 +1062,10 @@
           <w:p>
             <w:r>
               <w:rPr>
-                <w:b w:val="false"/>
-                <w:bCs w:val="false"/>
-                <w:color w:val="000000"/>
+                <w:rFonts w:ascii="Calibri" w:cs="Calibri" w:eastAsia="Calibri" w:hAnsi="Calibri"/>
+                <w:b w:val="false"/>
+                <w:bCs w:val="false"/>
+                <w:color w:val="333333"/>
                 <w:sz w:val="22"/>
                 <w:szCs w:val="22"/>
               </w:rPr>
@@ -768,9 +1082,10 @@
           <w:p>
             <w:r>
               <w:rPr>
-                <w:b/>
-                <w:bCs/>
-                <w:color w:val="000000"/>
+                <w:rFonts w:ascii="Calibri" w:cs="Calibri" w:eastAsia="Calibri" w:hAnsi="Calibri"/>
+                <w:b/>
+                <w:bCs/>
+                <w:color w:val="333333"/>
                 <w:sz w:val="22"/>
                 <w:szCs w:val="22"/>
               </w:rPr>
@@ -785,9 +1100,10 @@
           <w:p>
             <w:r>
               <w:rPr>
-                <w:b w:val="false"/>
-                <w:bCs w:val="false"/>
-                <w:color w:val="000000"/>
+                <w:rFonts w:ascii="Calibri" w:cs="Calibri" w:eastAsia="Calibri" w:hAnsi="Calibri"/>
+                <w:b w:val="false"/>
+                <w:bCs w:val="false"/>
+                <w:color w:val="333333"/>
                 <w:sz w:val="22"/>
                 <w:szCs w:val="22"/>
               </w:rPr>
@@ -804,9 +1120,10 @@
           <w:p>
             <w:r>
               <w:rPr>
-                <w:b/>
-                <w:bCs/>
-                <w:color w:val="000000"/>
+                <w:rFonts w:ascii="Calibri" w:cs="Calibri" w:eastAsia="Calibri" w:hAnsi="Calibri"/>
+                <w:b/>
+                <w:bCs/>
+                <w:color w:val="333333"/>
                 <w:sz w:val="22"/>
                 <w:szCs w:val="22"/>
               </w:rPr>
@@ -821,9 +1138,10 @@
           <w:p>
             <w:r>
               <w:rPr>
-                <w:b w:val="false"/>
-                <w:bCs w:val="false"/>
-                <w:color w:val="000000"/>
+                <w:rFonts w:ascii="Calibri" w:cs="Calibri" w:eastAsia="Calibri" w:hAnsi="Calibri"/>
+                <w:b w:val="false"/>
+                <w:bCs w:val="false"/>
+                <w:color w:val="333333"/>
                 <w:sz w:val="22"/>
                 <w:szCs w:val="22"/>
               </w:rPr>
@@ -840,9 +1158,10 @@
           <w:p>
             <w:r>
               <w:rPr>
-                <w:b/>
-                <w:bCs/>
-                <w:color w:val="000000"/>
+                <w:rFonts w:ascii="Calibri" w:cs="Calibri" w:eastAsia="Calibri" w:hAnsi="Calibri"/>
+                <w:b/>
+                <w:bCs/>
+                <w:color w:val="333333"/>
                 <w:sz w:val="22"/>
                 <w:szCs w:val="22"/>
               </w:rPr>
@@ -857,9 +1176,10 @@
           <w:p>
             <w:r>
               <w:rPr>
-                <w:b w:val="false"/>
-                <w:bCs w:val="false"/>
-                <w:color w:val="000000"/>
+                <w:rFonts w:ascii="Calibri" w:cs="Calibri" w:eastAsia="Calibri" w:hAnsi="Calibri"/>
+                <w:b w:val="false"/>
+                <w:bCs w:val="false"/>
+                <w:color w:val="333333"/>
                 <w:sz w:val="22"/>
                 <w:szCs w:val="22"/>
               </w:rPr>
@@ -899,6 +1219,7 @@
           <w:p>
             <w:r>
               <w:rPr>
+                <w:rFonts w:ascii="Calibri" w:cs="Calibri" w:eastAsia="Calibri" w:hAnsi="Calibri"/>
                 <w:b/>
                 <w:bCs/>
                 <w:color w:val="FFFFFF"/>
@@ -917,6 +1238,7 @@
           <w:p>
             <w:r>
               <w:rPr>
+                <w:rFonts w:ascii="Calibri" w:cs="Calibri" w:eastAsia="Calibri" w:hAnsi="Calibri"/>
                 <w:b/>
                 <w:bCs/>
                 <w:color w:val="FFFFFF"/>
@@ -936,9 +1258,10 @@
           <w:p>
             <w:r>
               <w:rPr>
-                <w:b/>
-                <w:bCs/>
-                <w:color w:val="000000"/>
+                <w:rFonts w:ascii="Calibri" w:cs="Calibri" w:eastAsia="Calibri" w:hAnsi="Calibri"/>
+                <w:b/>
+                <w:bCs/>
+                <w:color w:val="333333"/>
                 <w:sz w:val="22"/>
                 <w:szCs w:val="22"/>
               </w:rPr>
@@ -953,9 +1276,10 @@
           <w:p>
             <w:r>
               <w:rPr>
-                <w:b w:val="false"/>
-                <w:bCs w:val="false"/>
-                <w:color w:val="000000"/>
+                <w:rFonts w:ascii="Calibri" w:cs="Calibri" w:eastAsia="Calibri" w:hAnsi="Calibri"/>
+                <w:b w:val="false"/>
+                <w:bCs w:val="false"/>
+                <w:color w:val="333333"/>
                 <w:sz w:val="22"/>
                 <w:szCs w:val="22"/>
               </w:rPr>
@@ -972,9 +1296,10 @@
           <w:p>
             <w:r>
               <w:rPr>
-                <w:b/>
-                <w:bCs/>
-                <w:color w:val="000000"/>
+                <w:rFonts w:ascii="Calibri" w:cs="Calibri" w:eastAsia="Calibri" w:hAnsi="Calibri"/>
+                <w:b/>
+                <w:bCs/>
+                <w:color w:val="333333"/>
                 <w:sz w:val="22"/>
                 <w:szCs w:val="22"/>
               </w:rPr>
@@ -989,9 +1314,10 @@
           <w:p>
             <w:r>
               <w:rPr>
-                <w:b w:val="false"/>
-                <w:bCs w:val="false"/>
-                <w:color w:val="000000"/>
+                <w:rFonts w:ascii="Calibri" w:cs="Calibri" w:eastAsia="Calibri" w:hAnsi="Calibri"/>
+                <w:b w:val="false"/>
+                <w:bCs w:val="false"/>
+                <w:color w:val="333333"/>
                 <w:sz w:val="22"/>
                 <w:szCs w:val="22"/>
               </w:rPr>
@@ -1008,9 +1334,10 @@
           <w:p>
             <w:r>
               <w:rPr>
-                <w:b/>
-                <w:bCs/>
-                <w:color w:val="000000"/>
+                <w:rFonts w:ascii="Calibri" w:cs="Calibri" w:eastAsia="Calibri" w:hAnsi="Calibri"/>
+                <w:b/>
+                <w:bCs/>
+                <w:color w:val="333333"/>
                 <w:sz w:val="22"/>
                 <w:szCs w:val="22"/>
               </w:rPr>
@@ -1025,9 +1352,10 @@
           <w:p>
             <w:r>
               <w:rPr>
-                <w:b w:val="false"/>
-                <w:bCs w:val="false"/>
-                <w:color w:val="000000"/>
+                <w:rFonts w:ascii="Calibri" w:cs="Calibri" w:eastAsia="Calibri" w:hAnsi="Calibri"/>
+                <w:b w:val="false"/>
+                <w:bCs w:val="false"/>
+                <w:color w:val="333333"/>
                 <w:sz w:val="22"/>
                 <w:szCs w:val="22"/>
               </w:rPr>
@@ -1044,9 +1372,10 @@
           <w:p>
             <w:r>
               <w:rPr>
-                <w:b/>
-                <w:bCs/>
-                <w:color w:val="000000"/>
+                <w:rFonts w:ascii="Calibri" w:cs="Calibri" w:eastAsia="Calibri" w:hAnsi="Calibri"/>
+                <w:b/>
+                <w:bCs/>
+                <w:color w:val="333333"/>
                 <w:sz w:val="22"/>
                 <w:szCs w:val="22"/>
               </w:rPr>
@@ -1061,9 +1390,10 @@
           <w:p>
             <w:r>
               <w:rPr>
-                <w:b w:val="false"/>
-                <w:bCs w:val="false"/>
-                <w:color w:val="000000"/>
+                <w:rFonts w:ascii="Calibri" w:cs="Calibri" w:eastAsia="Calibri" w:hAnsi="Calibri"/>
+                <w:b w:val="false"/>
+                <w:bCs w:val="false"/>
+                <w:color w:val="333333"/>
                 <w:sz w:val="22"/>
                 <w:szCs w:val="22"/>
               </w:rPr>
@@ -1080,9 +1410,10 @@
           <w:p>
             <w:r>
               <w:rPr>
-                <w:b/>
-                <w:bCs/>
-                <w:color w:val="000000"/>
+                <w:rFonts w:ascii="Calibri" w:cs="Calibri" w:eastAsia="Calibri" w:hAnsi="Calibri"/>
+                <w:b/>
+                <w:bCs/>
+                <w:color w:val="333333"/>
                 <w:sz w:val="22"/>
                 <w:szCs w:val="22"/>
               </w:rPr>
@@ -1097,9 +1428,10 @@
           <w:p>
             <w:r>
               <w:rPr>
-                <w:b w:val="false"/>
-                <w:bCs w:val="false"/>
-                <w:color w:val="000000"/>
+                <w:rFonts w:ascii="Calibri" w:cs="Calibri" w:eastAsia="Calibri" w:hAnsi="Calibri"/>
+                <w:b w:val="false"/>
+                <w:bCs w:val="false"/>
+                <w:color w:val="333333"/>
                 <w:sz w:val="22"/>
                 <w:szCs w:val="22"/>
               </w:rPr>
@@ -1116,9 +1448,10 @@
           <w:p>
             <w:r>
               <w:rPr>
-                <w:b/>
-                <w:bCs/>
-                <w:color w:val="000000"/>
+                <w:rFonts w:ascii="Calibri" w:cs="Calibri" w:eastAsia="Calibri" w:hAnsi="Calibri"/>
+                <w:b/>
+                <w:bCs/>
+                <w:color w:val="333333"/>
                 <w:sz w:val="22"/>
                 <w:szCs w:val="22"/>
               </w:rPr>
@@ -1133,9 +1466,10 @@
           <w:p>
             <w:r>
               <w:rPr>
-                <w:b w:val="false"/>
-                <w:bCs w:val="false"/>
-                <w:color w:val="000000"/>
+                <w:rFonts w:ascii="Calibri" w:cs="Calibri" w:eastAsia="Calibri" w:hAnsi="Calibri"/>
+                <w:b w:val="false"/>
+                <w:bCs w:val="false"/>
+                <w:color w:val="333333"/>
                 <w:sz w:val="22"/>
                 <w:szCs w:val="22"/>
               </w:rPr>
@@ -1152,25 +1486,40 @@
     </w:p>
     <w:p>
       <w:pPr>
-        <w:pStyle w:val="Heading1"/>
-        <w:spacing w:after="200" w:before="400"/>
-      </w:pPr>
-      <w:r>
-        <w:t xml:space="preserve">2. Supervisor</w:t>
-      </w:r>
-    </w:p>
-    <w:p>
-      <w:pPr>
-        <w:spacing w:after="200"/>
+        <w:spacing w:after="100" w:before="300"/>
       </w:pPr>
       <w:r>
         <w:rPr>
+          <w:rFonts w:ascii="Calibri" w:cs="Calibri" w:eastAsia="Calibri" w:hAnsi="Calibri"/>
           <w:b/>
           <w:bCs/>
+          <w:color w:val="0b253e"/>
+          <w:sz w:val="26"/>
+          <w:szCs w:val="26"/>
+        </w:rPr>
+        <w:t xml:space="preserve">2.2 Supervisor</w:t>
+      </w:r>
+    </w:p>
+    <w:p>
+      <w:pPr>
+        <w:spacing w:after="200"/>
+      </w:pPr>
+      <w:r>
+        <w:rPr>
+          <w:rFonts w:ascii="Calibri" w:cs="Calibri" w:eastAsia="Calibri" w:hAnsi="Calibri"/>
+          <w:b/>
+          <w:bCs/>
+          <w:sz w:val="22"/>
+          <w:szCs w:val="22"/>
         </w:rPr>
         <w:t xml:space="preserve">Objetivo: </w:t>
       </w:r>
       <w:r>
+        <w:rPr>
+          <w:rFonts w:ascii="Calibri" w:cs="Calibri" w:eastAsia="Calibri" w:hAnsi="Calibri"/>
+          <w:sz w:val="22"/>
+          <w:szCs w:val="22"/>
+        </w:rPr>
         <w:t xml:space="preserve">Realizar governança do compartilhamento.</w:t>
       </w:r>
     </w:p>
@@ -1199,6 +1548,7 @@
           <w:p>
             <w:r>
               <w:rPr>
+                <w:rFonts w:ascii="Calibri" w:cs="Calibri" w:eastAsia="Calibri" w:hAnsi="Calibri"/>
                 <w:b/>
                 <w:bCs/>
                 <w:color w:val="FFFFFF"/>
@@ -1217,6 +1567,7 @@
           <w:p>
             <w:r>
               <w:rPr>
+                <w:rFonts w:ascii="Calibri" w:cs="Calibri" w:eastAsia="Calibri" w:hAnsi="Calibri"/>
                 <w:b/>
                 <w:bCs/>
                 <w:color w:val="FFFFFF"/>
@@ -1236,9 +1587,10 @@
           <w:p>
             <w:r>
               <w:rPr>
-                <w:b/>
-                <w:bCs/>
-                <w:color w:val="000000"/>
+                <w:rFonts w:ascii="Calibri" w:cs="Calibri" w:eastAsia="Calibri" w:hAnsi="Calibri"/>
+                <w:b/>
+                <w:bCs/>
+                <w:color w:val="333333"/>
                 <w:sz w:val="22"/>
                 <w:szCs w:val="22"/>
               </w:rPr>
@@ -1253,9 +1605,10 @@
           <w:p>
             <w:r>
               <w:rPr>
-                <w:b w:val="false"/>
-                <w:bCs w:val="false"/>
-                <w:color w:val="000000"/>
+                <w:rFonts w:ascii="Calibri" w:cs="Calibri" w:eastAsia="Calibri" w:hAnsi="Calibri"/>
+                <w:b w:val="false"/>
+                <w:bCs w:val="false"/>
+                <w:color w:val="333333"/>
                 <w:sz w:val="22"/>
                 <w:szCs w:val="22"/>
               </w:rPr>
@@ -1272,9 +1625,10 @@
           <w:p>
             <w:r>
               <w:rPr>
-                <w:b/>
-                <w:bCs/>
-                <w:color w:val="000000"/>
+                <w:rFonts w:ascii="Calibri" w:cs="Calibri" w:eastAsia="Calibri" w:hAnsi="Calibri"/>
+                <w:b/>
+                <w:bCs/>
+                <w:color w:val="333333"/>
                 <w:sz w:val="22"/>
                 <w:szCs w:val="22"/>
               </w:rPr>
@@ -1289,9 +1643,10 @@
           <w:p>
             <w:r>
               <w:rPr>
-                <w:b w:val="false"/>
-                <w:bCs w:val="false"/>
-                <w:color w:val="000000"/>
+                <w:rFonts w:ascii="Calibri" w:cs="Calibri" w:eastAsia="Calibri" w:hAnsi="Calibri"/>
+                <w:b w:val="false"/>
+                <w:bCs w:val="false"/>
+                <w:color w:val="333333"/>
                 <w:sz w:val="22"/>
                 <w:szCs w:val="22"/>
               </w:rPr>
@@ -1308,9 +1663,10 @@
           <w:p>
             <w:r>
               <w:rPr>
-                <w:b/>
-                <w:bCs/>
-                <w:color w:val="000000"/>
+                <w:rFonts w:ascii="Calibri" w:cs="Calibri" w:eastAsia="Calibri" w:hAnsi="Calibri"/>
+                <w:b/>
+                <w:bCs/>
+                <w:color w:val="333333"/>
                 <w:sz w:val="22"/>
                 <w:szCs w:val="22"/>
               </w:rPr>
@@ -1325,9 +1681,10 @@
           <w:p>
             <w:r>
               <w:rPr>
-                <w:b w:val="false"/>
-                <w:bCs w:val="false"/>
-                <w:color w:val="000000"/>
+                <w:rFonts w:ascii="Calibri" w:cs="Calibri" w:eastAsia="Calibri" w:hAnsi="Calibri"/>
+                <w:b w:val="false"/>
+                <w:bCs w:val="false"/>
+                <w:color w:val="333333"/>
                 <w:sz w:val="22"/>
                 <w:szCs w:val="22"/>
               </w:rPr>
@@ -1344,9 +1701,10 @@
           <w:p>
             <w:r>
               <w:rPr>
-                <w:b/>
-                <w:bCs/>
-                <w:color w:val="000000"/>
+                <w:rFonts w:ascii="Calibri" w:cs="Calibri" w:eastAsia="Calibri" w:hAnsi="Calibri"/>
+                <w:b/>
+                <w:bCs/>
+                <w:color w:val="333333"/>
                 <w:sz w:val="22"/>
                 <w:szCs w:val="22"/>
               </w:rPr>
@@ -1361,9 +1719,10 @@
           <w:p>
             <w:r>
               <w:rPr>
-                <w:b w:val="false"/>
-                <w:bCs w:val="false"/>
-                <w:color w:val="000000"/>
+                <w:rFonts w:ascii="Calibri" w:cs="Calibri" w:eastAsia="Calibri" w:hAnsi="Calibri"/>
+                <w:b w:val="false"/>
+                <w:bCs w:val="false"/>
+                <w:color w:val="333333"/>
                 <w:sz w:val="22"/>
                 <w:szCs w:val="22"/>
               </w:rPr>
@@ -1380,9 +1739,10 @@
           <w:p>
             <w:r>
               <w:rPr>
-                <w:b/>
-                <w:bCs/>
-                <w:color w:val="000000"/>
+                <w:rFonts w:ascii="Calibri" w:cs="Calibri" w:eastAsia="Calibri" w:hAnsi="Calibri"/>
+                <w:b/>
+                <w:bCs/>
+                <w:color w:val="333333"/>
                 <w:sz w:val="22"/>
                 <w:szCs w:val="22"/>
               </w:rPr>
@@ -1397,9 +1757,10 @@
           <w:p>
             <w:r>
               <w:rPr>
-                <w:b w:val="false"/>
-                <w:bCs w:val="false"/>
-                <w:color w:val="000000"/>
+                <w:rFonts w:ascii="Calibri" w:cs="Calibri" w:eastAsia="Calibri" w:hAnsi="Calibri"/>
+                <w:b w:val="false"/>
+                <w:bCs w:val="false"/>
+                <w:color w:val="333333"/>
                 <w:sz w:val="22"/>
                 <w:szCs w:val="22"/>
               </w:rPr>
@@ -1416,9 +1777,10 @@
           <w:p>
             <w:r>
               <w:rPr>
-                <w:b/>
-                <w:bCs/>
-                <w:color w:val="000000"/>
+                <w:rFonts w:ascii="Calibri" w:cs="Calibri" w:eastAsia="Calibri" w:hAnsi="Calibri"/>
+                <w:b/>
+                <w:bCs/>
+                <w:color w:val="333333"/>
                 <w:sz w:val="22"/>
                 <w:szCs w:val="22"/>
               </w:rPr>
@@ -1433,9 +1795,10 @@
           <w:p>
             <w:r>
               <w:rPr>
-                <w:b w:val="false"/>
-                <w:bCs w:val="false"/>
-                <w:color w:val="000000"/>
+                <w:rFonts w:ascii="Calibri" w:cs="Calibri" w:eastAsia="Calibri" w:hAnsi="Calibri"/>
+                <w:b w:val="false"/>
+                <w:bCs w:val="false"/>
+                <w:color w:val="333333"/>
                 <w:sz w:val="22"/>
                 <w:szCs w:val="22"/>
               </w:rPr>
@@ -1475,6 +1838,7 @@
           <w:p>
             <w:r>
               <w:rPr>
+                <w:rFonts w:ascii="Calibri" w:cs="Calibri" w:eastAsia="Calibri" w:hAnsi="Calibri"/>
                 <w:b/>
                 <w:bCs/>
                 <w:color w:val="FFFFFF"/>
@@ -1493,6 +1857,7 @@
           <w:p>
             <w:r>
               <w:rPr>
+                <w:rFonts w:ascii="Calibri" w:cs="Calibri" w:eastAsia="Calibri" w:hAnsi="Calibri"/>
                 <w:b/>
                 <w:bCs/>
                 <w:color w:val="FFFFFF"/>
@@ -1512,9 +1877,10 @@
           <w:p>
             <w:r>
               <w:rPr>
-                <w:b/>
-                <w:bCs/>
-                <w:color w:val="000000"/>
+                <w:rFonts w:ascii="Calibri" w:cs="Calibri" w:eastAsia="Calibri" w:hAnsi="Calibri"/>
+                <w:b/>
+                <w:bCs/>
+                <w:color w:val="333333"/>
                 <w:sz w:val="22"/>
                 <w:szCs w:val="22"/>
               </w:rPr>
@@ -1529,9 +1895,10 @@
           <w:p>
             <w:r>
               <w:rPr>
-                <w:b w:val="false"/>
-                <w:bCs w:val="false"/>
-                <w:color w:val="000000"/>
+                <w:rFonts w:ascii="Calibri" w:cs="Calibri" w:eastAsia="Calibri" w:hAnsi="Calibri"/>
+                <w:b w:val="false"/>
+                <w:bCs w:val="false"/>
+                <w:color w:val="333333"/>
                 <w:sz w:val="22"/>
                 <w:szCs w:val="22"/>
               </w:rPr>
@@ -1548,9 +1915,10 @@
           <w:p>
             <w:r>
               <w:rPr>
-                <w:b/>
-                <w:bCs/>
-                <w:color w:val="000000"/>
+                <w:rFonts w:ascii="Calibri" w:cs="Calibri" w:eastAsia="Calibri" w:hAnsi="Calibri"/>
+                <w:b/>
+                <w:bCs/>
+                <w:color w:val="333333"/>
                 <w:sz w:val="22"/>
                 <w:szCs w:val="22"/>
               </w:rPr>
@@ -1565,9 +1933,10 @@
           <w:p>
             <w:r>
               <w:rPr>
-                <w:b w:val="false"/>
-                <w:bCs w:val="false"/>
-                <w:color w:val="000000"/>
+                <w:rFonts w:ascii="Calibri" w:cs="Calibri" w:eastAsia="Calibri" w:hAnsi="Calibri"/>
+                <w:b w:val="false"/>
+                <w:bCs w:val="false"/>
+                <w:color w:val="333333"/>
                 <w:sz w:val="22"/>
                 <w:szCs w:val="22"/>
               </w:rPr>
@@ -1584,9 +1953,10 @@
           <w:p>
             <w:r>
               <w:rPr>
-                <w:b/>
-                <w:bCs/>
-                <w:color w:val="000000"/>
+                <w:rFonts w:ascii="Calibri" w:cs="Calibri" w:eastAsia="Calibri" w:hAnsi="Calibri"/>
+                <w:b/>
+                <w:bCs/>
+                <w:color w:val="333333"/>
                 <w:sz w:val="22"/>
                 <w:szCs w:val="22"/>
               </w:rPr>
@@ -1601,9 +1971,10 @@
           <w:p>
             <w:r>
               <w:rPr>
-                <w:b w:val="false"/>
-                <w:bCs w:val="false"/>
-                <w:color w:val="000000"/>
+                <w:rFonts w:ascii="Calibri" w:cs="Calibri" w:eastAsia="Calibri" w:hAnsi="Calibri"/>
+                <w:b w:val="false"/>
+                <w:bCs w:val="false"/>
+                <w:color w:val="333333"/>
                 <w:sz w:val="22"/>
                 <w:szCs w:val="22"/>
               </w:rPr>
@@ -1620,9 +1991,10 @@
           <w:p>
             <w:r>
               <w:rPr>
-                <w:b/>
-                <w:bCs/>
-                <w:color w:val="000000"/>
+                <w:rFonts w:ascii="Calibri" w:cs="Calibri" w:eastAsia="Calibri" w:hAnsi="Calibri"/>
+                <w:b/>
+                <w:bCs/>
+                <w:color w:val="333333"/>
                 <w:sz w:val="22"/>
                 <w:szCs w:val="22"/>
               </w:rPr>
@@ -1637,9 +2009,10 @@
           <w:p>
             <w:r>
               <w:rPr>
-                <w:b w:val="false"/>
-                <w:bCs w:val="false"/>
-                <w:color w:val="000000"/>
+                <w:rFonts w:ascii="Calibri" w:cs="Calibri" w:eastAsia="Calibri" w:hAnsi="Calibri"/>
+                <w:b w:val="false"/>
+                <w:bCs w:val="false"/>
+                <w:color w:val="333333"/>
                 <w:sz w:val="22"/>
                 <w:szCs w:val="22"/>
               </w:rPr>
@@ -1656,9 +2029,10 @@
           <w:p>
             <w:r>
               <w:rPr>
-                <w:b/>
-                <w:bCs/>
-                <w:color w:val="000000"/>
+                <w:rFonts w:ascii="Calibri" w:cs="Calibri" w:eastAsia="Calibri" w:hAnsi="Calibri"/>
+                <w:b/>
+                <w:bCs/>
+                <w:color w:val="333333"/>
                 <w:sz w:val="22"/>
                 <w:szCs w:val="22"/>
               </w:rPr>
@@ -1673,9 +2047,10 @@
           <w:p>
             <w:r>
               <w:rPr>
-                <w:b w:val="false"/>
-                <w:bCs w:val="false"/>
-                <w:color w:val="000000"/>
+                <w:rFonts w:ascii="Calibri" w:cs="Calibri" w:eastAsia="Calibri" w:hAnsi="Calibri"/>
+                <w:b w:val="false"/>
+                <w:bCs w:val="false"/>
+                <w:color w:val="333333"/>
                 <w:sz w:val="22"/>
                 <w:szCs w:val="22"/>
               </w:rPr>
@@ -1692,9 +2067,10 @@
           <w:p>
             <w:r>
               <w:rPr>
-                <w:b/>
-                <w:bCs/>
-                <w:color w:val="000000"/>
+                <w:rFonts w:ascii="Calibri" w:cs="Calibri" w:eastAsia="Calibri" w:hAnsi="Calibri"/>
+                <w:b/>
+                <w:bCs/>
+                <w:color w:val="333333"/>
                 <w:sz w:val="22"/>
                 <w:szCs w:val="22"/>
               </w:rPr>
@@ -1709,9 +2085,10 @@
           <w:p>
             <w:r>
               <w:rPr>
-                <w:b w:val="false"/>
-                <w:bCs w:val="false"/>
-                <w:color w:val="000000"/>
+                <w:rFonts w:ascii="Calibri" w:cs="Calibri" w:eastAsia="Calibri" w:hAnsi="Calibri"/>
+                <w:b w:val="false"/>
+                <w:bCs w:val="false"/>
+                <w:color w:val="333333"/>
                 <w:sz w:val="22"/>
                 <w:szCs w:val="22"/>
               </w:rPr>
@@ -1751,6 +2128,7 @@
           <w:p>
             <w:r>
               <w:rPr>
+                <w:rFonts w:ascii="Calibri" w:cs="Calibri" w:eastAsia="Calibri" w:hAnsi="Calibri"/>
                 <w:b/>
                 <w:bCs/>
                 <w:color w:val="FFFFFF"/>
@@ -1769,6 +2147,7 @@
           <w:p>
             <w:r>
               <w:rPr>
+                <w:rFonts w:ascii="Calibri" w:cs="Calibri" w:eastAsia="Calibri" w:hAnsi="Calibri"/>
                 <w:b/>
                 <w:bCs/>
                 <w:color w:val="FFFFFF"/>
@@ -1788,9 +2167,10 @@
           <w:p>
             <w:r>
               <w:rPr>
-                <w:b/>
-                <w:bCs/>
-                <w:color w:val="000000"/>
+                <w:rFonts w:ascii="Calibri" w:cs="Calibri" w:eastAsia="Calibri" w:hAnsi="Calibri"/>
+                <w:b/>
+                <w:bCs/>
+                <w:color w:val="333333"/>
                 <w:sz w:val="22"/>
                 <w:szCs w:val="22"/>
               </w:rPr>
@@ -1805,9 +2185,10 @@
           <w:p>
             <w:r>
               <w:rPr>
-                <w:b w:val="false"/>
-                <w:bCs w:val="false"/>
-                <w:color w:val="000000"/>
+                <w:rFonts w:ascii="Calibri" w:cs="Calibri" w:eastAsia="Calibri" w:hAnsi="Calibri"/>
+                <w:b w:val="false"/>
+                <w:bCs w:val="false"/>
+                <w:color w:val="333333"/>
                 <w:sz w:val="22"/>
                 <w:szCs w:val="22"/>
               </w:rPr>
@@ -1824,9 +2205,10 @@
           <w:p>
             <w:r>
               <w:rPr>
-                <w:b/>
-                <w:bCs/>
-                <w:color w:val="000000"/>
+                <w:rFonts w:ascii="Calibri" w:cs="Calibri" w:eastAsia="Calibri" w:hAnsi="Calibri"/>
+                <w:b/>
+                <w:bCs/>
+                <w:color w:val="333333"/>
                 <w:sz w:val="22"/>
                 <w:szCs w:val="22"/>
               </w:rPr>
@@ -1841,9 +2223,10 @@
           <w:p>
             <w:r>
               <w:rPr>
-                <w:b w:val="false"/>
-                <w:bCs w:val="false"/>
-                <w:color w:val="000000"/>
+                <w:rFonts w:ascii="Calibri" w:cs="Calibri" w:eastAsia="Calibri" w:hAnsi="Calibri"/>
+                <w:b w:val="false"/>
+                <w:bCs w:val="false"/>
+                <w:color w:val="333333"/>
                 <w:sz w:val="22"/>
                 <w:szCs w:val="22"/>
               </w:rPr>
@@ -1860,9 +2243,10 @@
           <w:p>
             <w:r>
               <w:rPr>
-                <w:b/>
-                <w:bCs/>
-                <w:color w:val="000000"/>
+                <w:rFonts w:ascii="Calibri" w:cs="Calibri" w:eastAsia="Calibri" w:hAnsi="Calibri"/>
+                <w:b/>
+                <w:bCs/>
+                <w:color w:val="333333"/>
                 <w:sz w:val="22"/>
                 <w:szCs w:val="22"/>
               </w:rPr>
@@ -1877,9 +2261,10 @@
           <w:p>
             <w:r>
               <w:rPr>
-                <w:b w:val="false"/>
-                <w:bCs w:val="false"/>
-                <w:color w:val="000000"/>
+                <w:rFonts w:ascii="Calibri" w:cs="Calibri" w:eastAsia="Calibri" w:hAnsi="Calibri"/>
+                <w:b w:val="false"/>
+                <w:bCs w:val="false"/>
+                <w:color w:val="333333"/>
                 <w:sz w:val="22"/>
                 <w:szCs w:val="22"/>
               </w:rPr>
@@ -1896,9 +2281,10 @@
           <w:p>
             <w:r>
               <w:rPr>
-                <w:b/>
-                <w:bCs/>
-                <w:color w:val="000000"/>
+                <w:rFonts w:ascii="Calibri" w:cs="Calibri" w:eastAsia="Calibri" w:hAnsi="Calibri"/>
+                <w:b/>
+                <w:bCs/>
+                <w:color w:val="333333"/>
                 <w:sz w:val="22"/>
                 <w:szCs w:val="22"/>
               </w:rPr>
@@ -1913,9 +2299,10 @@
           <w:p>
             <w:r>
               <w:rPr>
-                <w:b w:val="false"/>
-                <w:bCs w:val="false"/>
-                <w:color w:val="000000"/>
+                <w:rFonts w:ascii="Calibri" w:cs="Calibri" w:eastAsia="Calibri" w:hAnsi="Calibri"/>
+                <w:b w:val="false"/>
+                <w:bCs w:val="false"/>
+                <w:color w:val="333333"/>
                 <w:sz w:val="22"/>
                 <w:szCs w:val="22"/>
               </w:rPr>
@@ -1932,9 +2319,10 @@
           <w:p>
             <w:r>
               <w:rPr>
-                <w:b/>
-                <w:bCs/>
-                <w:color w:val="000000"/>
+                <w:rFonts w:ascii="Calibri" w:cs="Calibri" w:eastAsia="Calibri" w:hAnsi="Calibri"/>
+                <w:b/>
+                <w:bCs/>
+                <w:color w:val="333333"/>
                 <w:sz w:val="22"/>
                 <w:szCs w:val="22"/>
               </w:rPr>
@@ -1949,9 +2337,10 @@
           <w:p>
             <w:r>
               <w:rPr>
-                <w:b w:val="false"/>
-                <w:bCs w:val="false"/>
-                <w:color w:val="000000"/>
+                <w:rFonts w:ascii="Calibri" w:cs="Calibri" w:eastAsia="Calibri" w:hAnsi="Calibri"/>
+                <w:b w:val="false"/>
+                <w:bCs w:val="false"/>
+                <w:color w:val="333333"/>
                 <w:sz w:val="22"/>
                 <w:szCs w:val="22"/>
               </w:rPr>
@@ -1968,9 +2357,10 @@
           <w:p>
             <w:r>
               <w:rPr>
-                <w:b/>
-                <w:bCs/>
-                <w:color w:val="000000"/>
+                <w:rFonts w:ascii="Calibri" w:cs="Calibri" w:eastAsia="Calibri" w:hAnsi="Calibri"/>
+                <w:b/>
+                <w:bCs/>
+                <w:color w:val="333333"/>
                 <w:sz w:val="22"/>
                 <w:szCs w:val="22"/>
               </w:rPr>
@@ -1985,9 +2375,10 @@
           <w:p>
             <w:r>
               <w:rPr>
-                <w:b w:val="false"/>
-                <w:bCs w:val="false"/>
-                <w:color w:val="000000"/>
+                <w:rFonts w:ascii="Calibri" w:cs="Calibri" w:eastAsia="Calibri" w:hAnsi="Calibri"/>
+                <w:b w:val="false"/>
+                <w:bCs w:val="false"/>
+                <w:color w:val="333333"/>
                 <w:sz w:val="22"/>
                 <w:szCs w:val="22"/>
               </w:rPr>
@@ -2027,6 +2418,7 @@
           <w:p>
             <w:r>
               <w:rPr>
+                <w:rFonts w:ascii="Calibri" w:cs="Calibri" w:eastAsia="Calibri" w:hAnsi="Calibri"/>
                 <w:b/>
                 <w:bCs/>
                 <w:color w:val="FFFFFF"/>
@@ -2045,6 +2437,7 @@
           <w:p>
             <w:r>
               <w:rPr>
+                <w:rFonts w:ascii="Calibri" w:cs="Calibri" w:eastAsia="Calibri" w:hAnsi="Calibri"/>
                 <w:b/>
                 <w:bCs/>
                 <w:color w:val="FFFFFF"/>
@@ -2064,9 +2457,10 @@
           <w:p>
             <w:r>
               <w:rPr>
-                <w:b/>
-                <w:bCs/>
-                <w:color w:val="000000"/>
+                <w:rFonts w:ascii="Calibri" w:cs="Calibri" w:eastAsia="Calibri" w:hAnsi="Calibri"/>
+                <w:b/>
+                <w:bCs/>
+                <w:color w:val="333333"/>
                 <w:sz w:val="22"/>
                 <w:szCs w:val="22"/>
               </w:rPr>
@@ -2081,9 +2475,10 @@
           <w:p>
             <w:r>
               <w:rPr>
-                <w:b w:val="false"/>
-                <w:bCs w:val="false"/>
-                <w:color w:val="000000"/>
+                <w:rFonts w:ascii="Calibri" w:cs="Calibri" w:eastAsia="Calibri" w:hAnsi="Calibri"/>
+                <w:b w:val="false"/>
+                <w:bCs w:val="false"/>
+                <w:color w:val="333333"/>
                 <w:sz w:val="22"/>
                 <w:szCs w:val="22"/>
               </w:rPr>
@@ -2100,9 +2495,10 @@
           <w:p>
             <w:r>
               <w:rPr>
-                <w:b/>
-                <w:bCs/>
-                <w:color w:val="000000"/>
+                <w:rFonts w:ascii="Calibri" w:cs="Calibri" w:eastAsia="Calibri" w:hAnsi="Calibri"/>
+                <w:b/>
+                <w:bCs/>
+                <w:color w:val="333333"/>
                 <w:sz w:val="22"/>
                 <w:szCs w:val="22"/>
               </w:rPr>
@@ -2117,9 +2513,10 @@
           <w:p>
             <w:r>
               <w:rPr>
-                <w:b w:val="false"/>
-                <w:bCs w:val="false"/>
-                <w:color w:val="000000"/>
+                <w:rFonts w:ascii="Calibri" w:cs="Calibri" w:eastAsia="Calibri" w:hAnsi="Calibri"/>
+                <w:b w:val="false"/>
+                <w:bCs w:val="false"/>
+                <w:color w:val="333333"/>
                 <w:sz w:val="22"/>
                 <w:szCs w:val="22"/>
               </w:rPr>
@@ -2136,9 +2533,10 @@
           <w:p>
             <w:r>
               <w:rPr>
-                <w:b/>
-                <w:bCs/>
-                <w:color w:val="000000"/>
+                <w:rFonts w:ascii="Calibri" w:cs="Calibri" w:eastAsia="Calibri" w:hAnsi="Calibri"/>
+                <w:b/>
+                <w:bCs/>
+                <w:color w:val="333333"/>
                 <w:sz w:val="22"/>
                 <w:szCs w:val="22"/>
               </w:rPr>
@@ -2153,9 +2551,10 @@
           <w:p>
             <w:r>
               <w:rPr>
-                <w:b w:val="false"/>
-                <w:bCs w:val="false"/>
-                <w:color w:val="000000"/>
+                <w:rFonts w:ascii="Calibri" w:cs="Calibri" w:eastAsia="Calibri" w:hAnsi="Calibri"/>
+                <w:b w:val="false"/>
+                <w:bCs w:val="false"/>
+                <w:color w:val="333333"/>
                 <w:sz w:val="22"/>
                 <w:szCs w:val="22"/>
               </w:rPr>
@@ -2172,9 +2571,10 @@
           <w:p>
             <w:r>
               <w:rPr>
-                <w:b/>
-                <w:bCs/>
-                <w:color w:val="000000"/>
+                <w:rFonts w:ascii="Calibri" w:cs="Calibri" w:eastAsia="Calibri" w:hAnsi="Calibri"/>
+                <w:b/>
+                <w:bCs/>
+                <w:color w:val="333333"/>
                 <w:sz w:val="22"/>
                 <w:szCs w:val="22"/>
               </w:rPr>
@@ -2189,9 +2589,10 @@
           <w:p>
             <w:r>
               <w:rPr>
-                <w:b w:val="false"/>
-                <w:bCs w:val="false"/>
-                <w:color w:val="000000"/>
+                <w:rFonts w:ascii="Calibri" w:cs="Calibri" w:eastAsia="Calibri" w:hAnsi="Calibri"/>
+                <w:b w:val="false"/>
+                <w:bCs w:val="false"/>
+                <w:color w:val="333333"/>
                 <w:sz w:val="22"/>
                 <w:szCs w:val="22"/>
               </w:rPr>
@@ -2208,9 +2609,10 @@
           <w:p>
             <w:r>
               <w:rPr>
-                <w:b/>
-                <w:bCs/>
-                <w:color w:val="000000"/>
+                <w:rFonts w:ascii="Calibri" w:cs="Calibri" w:eastAsia="Calibri" w:hAnsi="Calibri"/>
+                <w:b/>
+                <w:bCs/>
+                <w:color w:val="333333"/>
                 <w:sz w:val="22"/>
                 <w:szCs w:val="22"/>
               </w:rPr>
@@ -2225,9 +2627,10 @@
           <w:p>
             <w:r>
               <w:rPr>
-                <w:b w:val="false"/>
-                <w:bCs w:val="false"/>
-                <w:color w:val="000000"/>
+                <w:rFonts w:ascii="Calibri" w:cs="Calibri" w:eastAsia="Calibri" w:hAnsi="Calibri"/>
+                <w:b w:val="false"/>
+                <w:bCs w:val="false"/>
+                <w:color w:val="333333"/>
                 <w:sz w:val="22"/>
                 <w:szCs w:val="22"/>
               </w:rPr>
@@ -2244,9 +2647,10 @@
           <w:p>
             <w:r>
               <w:rPr>
-                <w:b/>
-                <w:bCs/>
-                <w:color w:val="000000"/>
+                <w:rFonts w:ascii="Calibri" w:cs="Calibri" w:eastAsia="Calibri" w:hAnsi="Calibri"/>
+                <w:b/>
+                <w:bCs/>
+                <w:color w:val="333333"/>
                 <w:sz w:val="22"/>
                 <w:szCs w:val="22"/>
               </w:rPr>
@@ -2261,9 +2665,10 @@
           <w:p>
             <w:r>
               <w:rPr>
-                <w:b w:val="false"/>
-                <w:bCs w:val="false"/>
-                <w:color w:val="000000"/>
+                <w:rFonts w:ascii="Calibri" w:cs="Calibri" w:eastAsia="Calibri" w:hAnsi="Calibri"/>
+                <w:b w:val="false"/>
+                <w:bCs w:val="false"/>
+                <w:color w:val="333333"/>
                 <w:sz w:val="22"/>
                 <w:szCs w:val="22"/>
               </w:rPr>
@@ -2280,25 +2685,40 @@
     </w:p>
     <w:p>
       <w:pPr>
-        <w:pStyle w:val="Heading1"/>
-        <w:spacing w:after="200" w:before="400"/>
-      </w:pPr>
-      <w:r>
-        <w:t xml:space="preserve">3. Usuário Externo</w:t>
-      </w:r>
-    </w:p>
-    <w:p>
-      <w:pPr>
-        <w:spacing w:after="200"/>
+        <w:spacing w:after="100" w:before="300"/>
       </w:pPr>
       <w:r>
         <w:rPr>
+          <w:rFonts w:ascii="Calibri" w:cs="Calibri" w:eastAsia="Calibri" w:hAnsi="Calibri"/>
           <w:b/>
           <w:bCs/>
+          <w:color w:val="0b253e"/>
+          <w:sz w:val="26"/>
+          <w:szCs w:val="26"/>
+        </w:rPr>
+        <w:t xml:space="preserve">2.3 Usuário Externo</w:t>
+      </w:r>
+    </w:p>
+    <w:p>
+      <w:pPr>
+        <w:spacing w:after="200"/>
+      </w:pPr>
+      <w:r>
+        <w:rPr>
+          <w:rFonts w:ascii="Calibri" w:cs="Calibri" w:eastAsia="Calibri" w:hAnsi="Calibri"/>
+          <w:b/>
+          <w:bCs/>
+          <w:sz w:val="22"/>
+          <w:szCs w:val="22"/>
         </w:rPr>
         <w:t xml:space="preserve">Objetivo: </w:t>
       </w:r>
       <w:r>
+        <w:rPr>
+          <w:rFonts w:ascii="Calibri" w:cs="Calibri" w:eastAsia="Calibri" w:hAnsi="Calibri"/>
+          <w:sz w:val="22"/>
+          <w:szCs w:val="22"/>
+        </w:rPr>
         <w:t xml:space="preserve">Acessar arquivos autorizados de forma segura.</w:t>
       </w:r>
     </w:p>
@@ -2327,6 +2747,7 @@
           <w:p>
             <w:r>
               <w:rPr>
+                <w:rFonts w:ascii="Calibri" w:cs="Calibri" w:eastAsia="Calibri" w:hAnsi="Calibri"/>
                 <w:b/>
                 <w:bCs/>
                 <w:color w:val="FFFFFF"/>
@@ -2345,6 +2766,7 @@
           <w:p>
             <w:r>
               <w:rPr>
+                <w:rFonts w:ascii="Calibri" w:cs="Calibri" w:eastAsia="Calibri" w:hAnsi="Calibri"/>
                 <w:b/>
                 <w:bCs/>
                 <w:color w:val="FFFFFF"/>
@@ -2364,9 +2786,10 @@
           <w:p>
             <w:r>
               <w:rPr>
-                <w:b/>
-                <w:bCs/>
-                <w:color w:val="000000"/>
+                <w:rFonts w:ascii="Calibri" w:cs="Calibri" w:eastAsia="Calibri" w:hAnsi="Calibri"/>
+                <w:b/>
+                <w:bCs/>
+                <w:color w:val="333333"/>
                 <w:sz w:val="22"/>
                 <w:szCs w:val="22"/>
               </w:rPr>
@@ -2381,9 +2804,10 @@
           <w:p>
             <w:r>
               <w:rPr>
-                <w:b w:val="false"/>
-                <w:bCs w:val="false"/>
-                <w:color w:val="000000"/>
+                <w:rFonts w:ascii="Calibri" w:cs="Calibri" w:eastAsia="Calibri" w:hAnsi="Calibri"/>
+                <w:b w:val="false"/>
+                <w:bCs w:val="false"/>
+                <w:color w:val="333333"/>
                 <w:sz w:val="22"/>
                 <w:szCs w:val="22"/>
               </w:rPr>
@@ -2400,9 +2824,10 @@
           <w:p>
             <w:r>
               <w:rPr>
-                <w:b/>
-                <w:bCs/>
-                <w:color w:val="000000"/>
+                <w:rFonts w:ascii="Calibri" w:cs="Calibri" w:eastAsia="Calibri" w:hAnsi="Calibri"/>
+                <w:b/>
+                <w:bCs/>
+                <w:color w:val="333333"/>
                 <w:sz w:val="22"/>
                 <w:szCs w:val="22"/>
               </w:rPr>
@@ -2417,9 +2842,10 @@
           <w:p>
             <w:r>
               <w:rPr>
-                <w:b w:val="false"/>
-                <w:bCs w:val="false"/>
-                <w:color w:val="000000"/>
+                <w:rFonts w:ascii="Calibri" w:cs="Calibri" w:eastAsia="Calibri" w:hAnsi="Calibri"/>
+                <w:b w:val="false"/>
+                <w:bCs w:val="false"/>
+                <w:color w:val="333333"/>
                 <w:sz w:val="22"/>
                 <w:szCs w:val="22"/>
               </w:rPr>
@@ -2436,9 +2862,10 @@
           <w:p>
             <w:r>
               <w:rPr>
-                <w:b/>
-                <w:bCs/>
-                <w:color w:val="000000"/>
+                <w:rFonts w:ascii="Calibri" w:cs="Calibri" w:eastAsia="Calibri" w:hAnsi="Calibri"/>
+                <w:b/>
+                <w:bCs/>
+                <w:color w:val="333333"/>
                 <w:sz w:val="22"/>
                 <w:szCs w:val="22"/>
               </w:rPr>
@@ -2453,9 +2880,10 @@
           <w:p>
             <w:r>
               <w:rPr>
-                <w:b w:val="false"/>
-                <w:bCs w:val="false"/>
-                <w:color w:val="000000"/>
+                <w:rFonts w:ascii="Calibri" w:cs="Calibri" w:eastAsia="Calibri" w:hAnsi="Calibri"/>
+                <w:b w:val="false"/>
+                <w:bCs w:val="false"/>
+                <w:color w:val="333333"/>
                 <w:sz w:val="22"/>
                 <w:szCs w:val="22"/>
               </w:rPr>
@@ -2472,9 +2900,10 @@
           <w:p>
             <w:r>
               <w:rPr>
-                <w:b/>
-                <w:bCs/>
-                <w:color w:val="000000"/>
+                <w:rFonts w:ascii="Calibri" w:cs="Calibri" w:eastAsia="Calibri" w:hAnsi="Calibri"/>
+                <w:b/>
+                <w:bCs/>
+                <w:color w:val="333333"/>
                 <w:sz w:val="22"/>
                 <w:szCs w:val="22"/>
               </w:rPr>
@@ -2489,9 +2918,10 @@
           <w:p>
             <w:r>
               <w:rPr>
-                <w:b w:val="false"/>
-                <w:bCs w:val="false"/>
-                <w:color w:val="000000"/>
+                <w:rFonts w:ascii="Calibri" w:cs="Calibri" w:eastAsia="Calibri" w:hAnsi="Calibri"/>
+                <w:b w:val="false"/>
+                <w:bCs w:val="false"/>
+                <w:color w:val="333333"/>
                 <w:sz w:val="22"/>
                 <w:szCs w:val="22"/>
               </w:rPr>
@@ -2508,9 +2938,10 @@
           <w:p>
             <w:r>
               <w:rPr>
-                <w:b/>
-                <w:bCs/>
-                <w:color w:val="000000"/>
+                <w:rFonts w:ascii="Calibri" w:cs="Calibri" w:eastAsia="Calibri" w:hAnsi="Calibri"/>
+                <w:b/>
+                <w:bCs/>
+                <w:color w:val="333333"/>
                 <w:sz w:val="22"/>
                 <w:szCs w:val="22"/>
               </w:rPr>
@@ -2525,9 +2956,10 @@
           <w:p>
             <w:r>
               <w:rPr>
-                <w:b w:val="false"/>
-                <w:bCs w:val="false"/>
-                <w:color w:val="000000"/>
+                <w:rFonts w:ascii="Calibri" w:cs="Calibri" w:eastAsia="Calibri" w:hAnsi="Calibri"/>
+                <w:b w:val="false"/>
+                <w:bCs w:val="false"/>
+                <w:color w:val="333333"/>
                 <w:sz w:val="22"/>
                 <w:szCs w:val="22"/>
               </w:rPr>
@@ -2544,9 +2976,10 @@
           <w:p>
             <w:r>
               <w:rPr>
-                <w:b/>
-                <w:bCs/>
-                <w:color w:val="000000"/>
+                <w:rFonts w:ascii="Calibri" w:cs="Calibri" w:eastAsia="Calibri" w:hAnsi="Calibri"/>
+                <w:b/>
+                <w:bCs/>
+                <w:color w:val="333333"/>
                 <w:sz w:val="22"/>
                 <w:szCs w:val="22"/>
               </w:rPr>
@@ -2561,9 +2994,10 @@
           <w:p>
             <w:r>
               <w:rPr>
-                <w:b w:val="false"/>
-                <w:bCs w:val="false"/>
-                <w:color w:val="000000"/>
+                <w:rFonts w:ascii="Calibri" w:cs="Calibri" w:eastAsia="Calibri" w:hAnsi="Calibri"/>
+                <w:b w:val="false"/>
+                <w:bCs w:val="false"/>
+                <w:color w:val="333333"/>
                 <w:sz w:val="22"/>
                 <w:szCs w:val="22"/>
               </w:rPr>
@@ -2603,6 +3037,7 @@
           <w:p>
             <w:r>
               <w:rPr>
+                <w:rFonts w:ascii="Calibri" w:cs="Calibri" w:eastAsia="Calibri" w:hAnsi="Calibri"/>
                 <w:b/>
                 <w:bCs/>
                 <w:color w:val="FFFFFF"/>
@@ -2621,6 +3056,7 @@
           <w:p>
             <w:r>
               <w:rPr>
+                <w:rFonts w:ascii="Calibri" w:cs="Calibri" w:eastAsia="Calibri" w:hAnsi="Calibri"/>
                 <w:b/>
                 <w:bCs/>
                 <w:color w:val="FFFFFF"/>
@@ -2640,9 +3076,10 @@
           <w:p>
             <w:r>
               <w:rPr>
-                <w:b/>
-                <w:bCs/>
-                <w:color w:val="000000"/>
+                <w:rFonts w:ascii="Calibri" w:cs="Calibri" w:eastAsia="Calibri" w:hAnsi="Calibri"/>
+                <w:b/>
+                <w:bCs/>
+                <w:color w:val="333333"/>
                 <w:sz w:val="22"/>
                 <w:szCs w:val="22"/>
               </w:rPr>
@@ -2657,9 +3094,10 @@
           <w:p>
             <w:r>
               <w:rPr>
-                <w:b w:val="false"/>
-                <w:bCs w:val="false"/>
-                <w:color w:val="000000"/>
+                <w:rFonts w:ascii="Calibri" w:cs="Calibri" w:eastAsia="Calibri" w:hAnsi="Calibri"/>
+                <w:b w:val="false"/>
+                <w:bCs w:val="false"/>
+                <w:color w:val="333333"/>
                 <w:sz w:val="22"/>
                 <w:szCs w:val="22"/>
               </w:rPr>
@@ -2676,9 +3114,10 @@
           <w:p>
             <w:r>
               <w:rPr>
-                <w:b/>
-                <w:bCs/>
-                <w:color w:val="000000"/>
+                <w:rFonts w:ascii="Calibri" w:cs="Calibri" w:eastAsia="Calibri" w:hAnsi="Calibri"/>
+                <w:b/>
+                <w:bCs/>
+                <w:color w:val="333333"/>
                 <w:sz w:val="22"/>
                 <w:szCs w:val="22"/>
               </w:rPr>
@@ -2693,9 +3132,10 @@
           <w:p>
             <w:r>
               <w:rPr>
-                <w:b w:val="false"/>
-                <w:bCs w:val="false"/>
-                <w:color w:val="000000"/>
+                <w:rFonts w:ascii="Calibri" w:cs="Calibri" w:eastAsia="Calibri" w:hAnsi="Calibri"/>
+                <w:b w:val="false"/>
+                <w:bCs w:val="false"/>
+                <w:color w:val="333333"/>
                 <w:sz w:val="22"/>
                 <w:szCs w:val="22"/>
               </w:rPr>
@@ -2712,9 +3152,10 @@
           <w:p>
             <w:r>
               <w:rPr>
-                <w:b/>
-                <w:bCs/>
-                <w:color w:val="000000"/>
+                <w:rFonts w:ascii="Calibri" w:cs="Calibri" w:eastAsia="Calibri" w:hAnsi="Calibri"/>
+                <w:b/>
+                <w:bCs/>
+                <w:color w:val="333333"/>
                 <w:sz w:val="22"/>
                 <w:szCs w:val="22"/>
               </w:rPr>
@@ -2729,9 +3170,10 @@
           <w:p>
             <w:r>
               <w:rPr>
-                <w:b w:val="false"/>
-                <w:bCs w:val="false"/>
-                <w:color w:val="000000"/>
+                <w:rFonts w:ascii="Calibri" w:cs="Calibri" w:eastAsia="Calibri" w:hAnsi="Calibri"/>
+                <w:b w:val="false"/>
+                <w:bCs w:val="false"/>
+                <w:color w:val="333333"/>
                 <w:sz w:val="22"/>
                 <w:szCs w:val="22"/>
               </w:rPr>
@@ -2748,9 +3190,10 @@
           <w:p>
             <w:r>
               <w:rPr>
-                <w:b/>
-                <w:bCs/>
-                <w:color w:val="000000"/>
+                <w:rFonts w:ascii="Calibri" w:cs="Calibri" w:eastAsia="Calibri" w:hAnsi="Calibri"/>
+                <w:b/>
+                <w:bCs/>
+                <w:color w:val="333333"/>
                 <w:sz w:val="22"/>
                 <w:szCs w:val="22"/>
               </w:rPr>
@@ -2765,9 +3208,10 @@
           <w:p>
             <w:r>
               <w:rPr>
-                <w:b w:val="false"/>
-                <w:bCs w:val="false"/>
-                <w:color w:val="000000"/>
+                <w:rFonts w:ascii="Calibri" w:cs="Calibri" w:eastAsia="Calibri" w:hAnsi="Calibri"/>
+                <w:b w:val="false"/>
+                <w:bCs w:val="false"/>
+                <w:color w:val="333333"/>
                 <w:sz w:val="22"/>
                 <w:szCs w:val="22"/>
               </w:rPr>
@@ -2784,9 +3228,10 @@
           <w:p>
             <w:r>
               <w:rPr>
-                <w:b/>
-                <w:bCs/>
-                <w:color w:val="000000"/>
+                <w:rFonts w:ascii="Calibri" w:cs="Calibri" w:eastAsia="Calibri" w:hAnsi="Calibri"/>
+                <w:b/>
+                <w:bCs/>
+                <w:color w:val="333333"/>
                 <w:sz w:val="22"/>
                 <w:szCs w:val="22"/>
               </w:rPr>
@@ -2801,9 +3246,10 @@
           <w:p>
             <w:r>
               <w:rPr>
-                <w:b w:val="false"/>
-                <w:bCs w:val="false"/>
-                <w:color w:val="000000"/>
+                <w:rFonts w:ascii="Calibri" w:cs="Calibri" w:eastAsia="Calibri" w:hAnsi="Calibri"/>
+                <w:b w:val="false"/>
+                <w:bCs w:val="false"/>
+                <w:color w:val="333333"/>
                 <w:sz w:val="22"/>
                 <w:szCs w:val="22"/>
               </w:rPr>
@@ -2820,9 +3266,10 @@
           <w:p>
             <w:r>
               <w:rPr>
-                <w:b/>
-                <w:bCs/>
-                <w:color w:val="000000"/>
+                <w:rFonts w:ascii="Calibri" w:cs="Calibri" w:eastAsia="Calibri" w:hAnsi="Calibri"/>
+                <w:b/>
+                <w:bCs/>
+                <w:color w:val="333333"/>
                 <w:sz w:val="22"/>
                 <w:szCs w:val="22"/>
               </w:rPr>
@@ -2837,9 +3284,10 @@
           <w:p>
             <w:r>
               <w:rPr>
-                <w:b w:val="false"/>
-                <w:bCs w:val="false"/>
-                <w:color w:val="000000"/>
+                <w:rFonts w:ascii="Calibri" w:cs="Calibri" w:eastAsia="Calibri" w:hAnsi="Calibri"/>
+                <w:b w:val="false"/>
+                <w:bCs w:val="false"/>
+                <w:color w:val="333333"/>
                 <w:sz w:val="22"/>
                 <w:szCs w:val="22"/>
               </w:rPr>
@@ -2879,6 +3327,7 @@
           <w:p>
             <w:r>
               <w:rPr>
+                <w:rFonts w:ascii="Calibri" w:cs="Calibri" w:eastAsia="Calibri" w:hAnsi="Calibri"/>
                 <w:b/>
                 <w:bCs/>
                 <w:color w:val="FFFFFF"/>
@@ -2897,6 +3346,7 @@
           <w:p>
             <w:r>
               <w:rPr>
+                <w:rFonts w:ascii="Calibri" w:cs="Calibri" w:eastAsia="Calibri" w:hAnsi="Calibri"/>
                 <w:b/>
                 <w:bCs/>
                 <w:color w:val="FFFFFF"/>
@@ -2916,9 +3366,10 @@
           <w:p>
             <w:r>
               <w:rPr>
-                <w:b/>
-                <w:bCs/>
-                <w:color w:val="000000"/>
+                <w:rFonts w:ascii="Calibri" w:cs="Calibri" w:eastAsia="Calibri" w:hAnsi="Calibri"/>
+                <w:b/>
+                <w:bCs/>
+                <w:color w:val="333333"/>
                 <w:sz w:val="22"/>
                 <w:szCs w:val="22"/>
               </w:rPr>
@@ -2933,9 +3384,10 @@
           <w:p>
             <w:r>
               <w:rPr>
-                <w:b w:val="false"/>
-                <w:bCs w:val="false"/>
-                <w:color w:val="000000"/>
+                <w:rFonts w:ascii="Calibri" w:cs="Calibri" w:eastAsia="Calibri" w:hAnsi="Calibri"/>
+                <w:b w:val="false"/>
+                <w:bCs w:val="false"/>
+                <w:color w:val="333333"/>
                 <w:sz w:val="22"/>
                 <w:szCs w:val="22"/>
               </w:rPr>
@@ -2952,9 +3404,10 @@
           <w:p>
             <w:r>
               <w:rPr>
-                <w:b/>
-                <w:bCs/>
-                <w:color w:val="000000"/>
+                <w:rFonts w:ascii="Calibri" w:cs="Calibri" w:eastAsia="Calibri" w:hAnsi="Calibri"/>
+                <w:b/>
+                <w:bCs/>
+                <w:color w:val="333333"/>
                 <w:sz w:val="22"/>
                 <w:szCs w:val="22"/>
               </w:rPr>
@@ -2969,9 +3422,10 @@
           <w:p>
             <w:r>
               <w:rPr>
-                <w:b w:val="false"/>
-                <w:bCs w:val="false"/>
-                <w:color w:val="000000"/>
+                <w:rFonts w:ascii="Calibri" w:cs="Calibri" w:eastAsia="Calibri" w:hAnsi="Calibri"/>
+                <w:b w:val="false"/>
+                <w:bCs w:val="false"/>
+                <w:color w:val="333333"/>
                 <w:sz w:val="22"/>
                 <w:szCs w:val="22"/>
               </w:rPr>
@@ -2988,9 +3442,10 @@
           <w:p>
             <w:r>
               <w:rPr>
-                <w:b/>
-                <w:bCs/>
-                <w:color w:val="000000"/>
+                <w:rFonts w:ascii="Calibri" w:cs="Calibri" w:eastAsia="Calibri" w:hAnsi="Calibri"/>
+                <w:b/>
+                <w:bCs/>
+                <w:color w:val="333333"/>
                 <w:sz w:val="22"/>
                 <w:szCs w:val="22"/>
               </w:rPr>
@@ -3005,9 +3460,10 @@
           <w:p>
             <w:r>
               <w:rPr>
-                <w:b w:val="false"/>
-                <w:bCs w:val="false"/>
-                <w:color w:val="000000"/>
+                <w:rFonts w:ascii="Calibri" w:cs="Calibri" w:eastAsia="Calibri" w:hAnsi="Calibri"/>
+                <w:b w:val="false"/>
+                <w:bCs w:val="false"/>
+                <w:color w:val="333333"/>
                 <w:sz w:val="22"/>
                 <w:szCs w:val="22"/>
               </w:rPr>
@@ -3024,9 +3480,10 @@
           <w:p>
             <w:r>
               <w:rPr>
-                <w:b/>
-                <w:bCs/>
-                <w:color w:val="000000"/>
+                <w:rFonts w:ascii="Calibri" w:cs="Calibri" w:eastAsia="Calibri" w:hAnsi="Calibri"/>
+                <w:b/>
+                <w:bCs/>
+                <w:color w:val="333333"/>
                 <w:sz w:val="22"/>
                 <w:szCs w:val="22"/>
               </w:rPr>
@@ -3041,9 +3498,10 @@
           <w:p>
             <w:r>
               <w:rPr>
-                <w:b w:val="false"/>
-                <w:bCs w:val="false"/>
-                <w:color w:val="000000"/>
+                <w:rFonts w:ascii="Calibri" w:cs="Calibri" w:eastAsia="Calibri" w:hAnsi="Calibri"/>
+                <w:b w:val="false"/>
+                <w:bCs w:val="false"/>
+                <w:color w:val="333333"/>
                 <w:sz w:val="22"/>
                 <w:szCs w:val="22"/>
               </w:rPr>
@@ -3060,9 +3518,10 @@
           <w:p>
             <w:r>
               <w:rPr>
-                <w:b/>
-                <w:bCs/>
-                <w:color w:val="000000"/>
+                <w:rFonts w:ascii="Calibri" w:cs="Calibri" w:eastAsia="Calibri" w:hAnsi="Calibri"/>
+                <w:b/>
+                <w:bCs/>
+                <w:color w:val="333333"/>
                 <w:sz w:val="22"/>
                 <w:szCs w:val="22"/>
               </w:rPr>
@@ -3077,9 +3536,10 @@
           <w:p>
             <w:r>
               <w:rPr>
-                <w:b w:val="false"/>
-                <w:bCs w:val="false"/>
-                <w:color w:val="000000"/>
+                <w:rFonts w:ascii="Calibri" w:cs="Calibri" w:eastAsia="Calibri" w:hAnsi="Calibri"/>
+                <w:b w:val="false"/>
+                <w:bCs w:val="false"/>
+                <w:color w:val="333333"/>
                 <w:sz w:val="22"/>
                 <w:szCs w:val="22"/>
               </w:rPr>
@@ -3096,9 +3556,10 @@
           <w:p>
             <w:r>
               <w:rPr>
-                <w:b/>
-                <w:bCs/>
-                <w:color w:val="000000"/>
+                <w:rFonts w:ascii="Calibri" w:cs="Calibri" w:eastAsia="Calibri" w:hAnsi="Calibri"/>
+                <w:b/>
+                <w:bCs/>
+                <w:color w:val="333333"/>
                 <w:sz w:val="22"/>
                 <w:szCs w:val="22"/>
               </w:rPr>
@@ -3113,9 +3574,10 @@
           <w:p>
             <w:r>
               <w:rPr>
-                <w:b w:val="false"/>
-                <w:bCs w:val="false"/>
-                <w:color w:val="000000"/>
+                <w:rFonts w:ascii="Calibri" w:cs="Calibri" w:eastAsia="Calibri" w:hAnsi="Calibri"/>
+                <w:b w:val="false"/>
+                <w:bCs w:val="false"/>
+                <w:color w:val="333333"/>
                 <w:sz w:val="22"/>
                 <w:szCs w:val="22"/>
               </w:rPr>
@@ -3155,6 +3617,7 @@
           <w:p>
             <w:r>
               <w:rPr>
+                <w:rFonts w:ascii="Calibri" w:cs="Calibri" w:eastAsia="Calibri" w:hAnsi="Calibri"/>
                 <w:b/>
                 <w:bCs/>
                 <w:color w:val="FFFFFF"/>
@@ -3173,6 +3636,7 @@
           <w:p>
             <w:r>
               <w:rPr>
+                <w:rFonts w:ascii="Calibri" w:cs="Calibri" w:eastAsia="Calibri" w:hAnsi="Calibri"/>
                 <w:b/>
                 <w:bCs/>
                 <w:color w:val="FFFFFF"/>
@@ -3192,9 +3656,10 @@
           <w:p>
             <w:r>
               <w:rPr>
-                <w:b/>
-                <w:bCs/>
-                <w:color w:val="000000"/>
+                <w:rFonts w:ascii="Calibri" w:cs="Calibri" w:eastAsia="Calibri" w:hAnsi="Calibri"/>
+                <w:b/>
+                <w:bCs/>
+                <w:color w:val="333333"/>
                 <w:sz w:val="22"/>
                 <w:szCs w:val="22"/>
               </w:rPr>
@@ -3209,9 +3674,10 @@
           <w:p>
             <w:r>
               <w:rPr>
-                <w:b w:val="false"/>
-                <w:bCs w:val="false"/>
-                <w:color w:val="000000"/>
+                <w:rFonts w:ascii="Calibri" w:cs="Calibri" w:eastAsia="Calibri" w:hAnsi="Calibri"/>
+                <w:b w:val="false"/>
+                <w:bCs w:val="false"/>
+                <w:color w:val="333333"/>
                 <w:sz w:val="22"/>
                 <w:szCs w:val="22"/>
               </w:rPr>
@@ -3228,9 +3694,10 @@
           <w:p>
             <w:r>
               <w:rPr>
-                <w:b/>
-                <w:bCs/>
-                <w:color w:val="000000"/>
+                <w:rFonts w:ascii="Calibri" w:cs="Calibri" w:eastAsia="Calibri" w:hAnsi="Calibri"/>
+                <w:b/>
+                <w:bCs/>
+                <w:color w:val="333333"/>
                 <w:sz w:val="22"/>
                 <w:szCs w:val="22"/>
               </w:rPr>
@@ -3245,9 +3712,10 @@
           <w:p>
             <w:r>
               <w:rPr>
-                <w:b w:val="false"/>
-                <w:bCs w:val="false"/>
-                <w:color w:val="000000"/>
+                <w:rFonts w:ascii="Calibri" w:cs="Calibri" w:eastAsia="Calibri" w:hAnsi="Calibri"/>
+                <w:b w:val="false"/>
+                <w:bCs w:val="false"/>
+                <w:color w:val="333333"/>
                 <w:sz w:val="22"/>
                 <w:szCs w:val="22"/>
               </w:rPr>
@@ -3264,9 +3732,10 @@
           <w:p>
             <w:r>
               <w:rPr>
-                <w:b/>
-                <w:bCs/>
-                <w:color w:val="000000"/>
+                <w:rFonts w:ascii="Calibri" w:cs="Calibri" w:eastAsia="Calibri" w:hAnsi="Calibri"/>
+                <w:b/>
+                <w:bCs/>
+                <w:color w:val="333333"/>
                 <w:sz w:val="22"/>
                 <w:szCs w:val="22"/>
               </w:rPr>
@@ -3281,9 +3750,10 @@
           <w:p>
             <w:r>
               <w:rPr>
-                <w:b w:val="false"/>
-                <w:bCs w:val="false"/>
-                <w:color w:val="000000"/>
+                <w:rFonts w:ascii="Calibri" w:cs="Calibri" w:eastAsia="Calibri" w:hAnsi="Calibri"/>
+                <w:b w:val="false"/>
+                <w:bCs w:val="false"/>
+                <w:color w:val="333333"/>
                 <w:sz w:val="22"/>
                 <w:szCs w:val="22"/>
               </w:rPr>
@@ -3300,9 +3770,10 @@
           <w:p>
             <w:r>
               <w:rPr>
-                <w:b/>
-                <w:bCs/>
-                <w:color w:val="000000"/>
+                <w:rFonts w:ascii="Calibri" w:cs="Calibri" w:eastAsia="Calibri" w:hAnsi="Calibri"/>
+                <w:b/>
+                <w:bCs/>
+                <w:color w:val="333333"/>
                 <w:sz w:val="22"/>
                 <w:szCs w:val="22"/>
               </w:rPr>
@@ -3317,9 +3788,10 @@
           <w:p>
             <w:r>
               <w:rPr>
-                <w:b w:val="false"/>
-                <w:bCs w:val="false"/>
-                <w:color w:val="000000"/>
+                <w:rFonts w:ascii="Calibri" w:cs="Calibri" w:eastAsia="Calibri" w:hAnsi="Calibri"/>
+                <w:b w:val="false"/>
+                <w:bCs w:val="false"/>
+                <w:color w:val="333333"/>
                 <w:sz w:val="22"/>
                 <w:szCs w:val="22"/>
               </w:rPr>
@@ -3336,9 +3808,10 @@
           <w:p>
             <w:r>
               <w:rPr>
-                <w:b/>
-                <w:bCs/>
-                <w:color w:val="000000"/>
+                <w:rFonts w:ascii="Calibri" w:cs="Calibri" w:eastAsia="Calibri" w:hAnsi="Calibri"/>
+                <w:b/>
+                <w:bCs/>
+                <w:color w:val="333333"/>
                 <w:sz w:val="22"/>
                 <w:szCs w:val="22"/>
               </w:rPr>
@@ -3353,9 +3826,10 @@
           <w:p>
             <w:r>
               <w:rPr>
-                <w:b w:val="false"/>
-                <w:bCs w:val="false"/>
-                <w:color w:val="000000"/>
+                <w:rFonts w:ascii="Calibri" w:cs="Calibri" w:eastAsia="Calibri" w:hAnsi="Calibri"/>
+                <w:b w:val="false"/>
+                <w:bCs w:val="false"/>
+                <w:color w:val="333333"/>
                 <w:sz w:val="22"/>
                 <w:szCs w:val="22"/>
               </w:rPr>
@@ -3372,9 +3846,10 @@
           <w:p>
             <w:r>
               <w:rPr>
-                <w:b/>
-                <w:bCs/>
-                <w:color w:val="000000"/>
+                <w:rFonts w:ascii="Calibri" w:cs="Calibri" w:eastAsia="Calibri" w:hAnsi="Calibri"/>
+                <w:b/>
+                <w:bCs/>
+                <w:color w:val="333333"/>
                 <w:sz w:val="22"/>
                 <w:szCs w:val="22"/>
               </w:rPr>
@@ -3389,9 +3864,10 @@
           <w:p>
             <w:r>
               <w:rPr>
-                <w:b w:val="false"/>
-                <w:bCs w:val="false"/>
-                <w:color w:val="000000"/>
+                <w:rFonts w:ascii="Calibri" w:cs="Calibri" w:eastAsia="Calibri" w:hAnsi="Calibri"/>
+                <w:b w:val="false"/>
+                <w:bCs w:val="false"/>
+                <w:color w:val="333333"/>
                 <w:sz w:val="22"/>
                 <w:szCs w:val="22"/>
               </w:rPr>
@@ -3408,25 +3884,40 @@
     </w:p>
     <w:p>
       <w:pPr>
-        <w:pStyle w:val="Heading1"/>
-        <w:spacing w:after="200" w:before="400"/>
-      </w:pPr>
-      <w:r>
-        <w:t xml:space="preserve">4. Administrador</w:t>
-      </w:r>
-    </w:p>
-    <w:p>
-      <w:pPr>
-        <w:spacing w:after="200"/>
+        <w:spacing w:after="100" w:before="300"/>
       </w:pPr>
       <w:r>
         <w:rPr>
+          <w:rFonts w:ascii="Calibri" w:cs="Calibri" w:eastAsia="Calibri" w:hAnsi="Calibri"/>
           <w:b/>
           <w:bCs/>
+          <w:color w:val="0b253e"/>
+          <w:sz w:val="26"/>
+          <w:szCs w:val="26"/>
+        </w:rPr>
+        <w:t xml:space="preserve">2.4 Administrador</w:t>
+      </w:r>
+    </w:p>
+    <w:p>
+      <w:pPr>
+        <w:spacing w:after="200"/>
+      </w:pPr>
+      <w:r>
+        <w:rPr>
+          <w:rFonts w:ascii="Calibri" w:cs="Calibri" w:eastAsia="Calibri" w:hAnsi="Calibri"/>
+          <w:b/>
+          <w:bCs/>
+          <w:sz w:val="22"/>
+          <w:szCs w:val="22"/>
         </w:rPr>
         <w:t xml:space="preserve">Objetivo: </w:t>
       </w:r>
       <w:r>
+        <w:rPr>
+          <w:rFonts w:ascii="Calibri" w:cs="Calibri" w:eastAsia="Calibri" w:hAnsi="Calibri"/>
+          <w:sz w:val="22"/>
+          <w:szCs w:val="22"/>
+        </w:rPr>
         <w:t xml:space="preserve">Auditoria e monitoramento do sistema.</w:t>
       </w:r>
     </w:p>
@@ -3455,6 +3946,7 @@
           <w:p>
             <w:r>
               <w:rPr>
+                <w:rFonts w:ascii="Calibri" w:cs="Calibri" w:eastAsia="Calibri" w:hAnsi="Calibri"/>
                 <w:b/>
                 <w:bCs/>
                 <w:color w:val="FFFFFF"/>
@@ -3473,6 +3965,7 @@
           <w:p>
             <w:r>
               <w:rPr>
+                <w:rFonts w:ascii="Calibri" w:cs="Calibri" w:eastAsia="Calibri" w:hAnsi="Calibri"/>
                 <w:b/>
                 <w:bCs/>
                 <w:color w:val="FFFFFF"/>
@@ -3492,9 +3985,10 @@
           <w:p>
             <w:r>
               <w:rPr>
-                <w:b/>
-                <w:bCs/>
-                <w:color w:val="000000"/>
+                <w:rFonts w:ascii="Calibri" w:cs="Calibri" w:eastAsia="Calibri" w:hAnsi="Calibri"/>
+                <w:b/>
+                <w:bCs/>
+                <w:color w:val="333333"/>
                 <w:sz w:val="22"/>
                 <w:szCs w:val="22"/>
               </w:rPr>
@@ -3509,9 +4003,10 @@
           <w:p>
             <w:r>
               <w:rPr>
-                <w:b w:val="false"/>
-                <w:bCs w:val="false"/>
-                <w:color w:val="000000"/>
+                <w:rFonts w:ascii="Calibri" w:cs="Calibri" w:eastAsia="Calibri" w:hAnsi="Calibri"/>
+                <w:b w:val="false"/>
+                <w:bCs w:val="false"/>
+                <w:color w:val="333333"/>
                 <w:sz w:val="22"/>
                 <w:szCs w:val="22"/>
               </w:rPr>
@@ -3528,9 +4023,10 @@
           <w:p>
             <w:r>
               <w:rPr>
-                <w:b/>
-                <w:bCs/>
-                <w:color w:val="000000"/>
+                <w:rFonts w:ascii="Calibri" w:cs="Calibri" w:eastAsia="Calibri" w:hAnsi="Calibri"/>
+                <w:b/>
+                <w:bCs/>
+                <w:color w:val="333333"/>
                 <w:sz w:val="22"/>
                 <w:szCs w:val="22"/>
               </w:rPr>
@@ -3545,9 +4041,10 @@
           <w:p>
             <w:r>
               <w:rPr>
-                <w:b w:val="false"/>
-                <w:bCs w:val="false"/>
-                <w:color w:val="000000"/>
+                <w:rFonts w:ascii="Calibri" w:cs="Calibri" w:eastAsia="Calibri" w:hAnsi="Calibri"/>
+                <w:b w:val="false"/>
+                <w:bCs w:val="false"/>
+                <w:color w:val="333333"/>
                 <w:sz w:val="22"/>
                 <w:szCs w:val="22"/>
               </w:rPr>
@@ -3564,9 +4061,10 @@
           <w:p>
             <w:r>
               <w:rPr>
-                <w:b/>
-                <w:bCs/>
-                <w:color w:val="000000"/>
+                <w:rFonts w:ascii="Calibri" w:cs="Calibri" w:eastAsia="Calibri" w:hAnsi="Calibri"/>
+                <w:b/>
+                <w:bCs/>
+                <w:color w:val="333333"/>
                 <w:sz w:val="22"/>
                 <w:szCs w:val="22"/>
               </w:rPr>
@@ -3581,9 +4079,10 @@
           <w:p>
             <w:r>
               <w:rPr>
-                <w:b w:val="false"/>
-                <w:bCs w:val="false"/>
-                <w:color w:val="000000"/>
+                <w:rFonts w:ascii="Calibri" w:cs="Calibri" w:eastAsia="Calibri" w:hAnsi="Calibri"/>
+                <w:b w:val="false"/>
+                <w:bCs w:val="false"/>
+                <w:color w:val="333333"/>
                 <w:sz w:val="22"/>
                 <w:szCs w:val="22"/>
               </w:rPr>
@@ -3600,9 +4099,10 @@
           <w:p>
             <w:r>
               <w:rPr>
-                <w:b/>
-                <w:bCs/>
-                <w:color w:val="000000"/>
+                <w:rFonts w:ascii="Calibri" w:cs="Calibri" w:eastAsia="Calibri" w:hAnsi="Calibri"/>
+                <w:b/>
+                <w:bCs/>
+                <w:color w:val="333333"/>
                 <w:sz w:val="22"/>
                 <w:szCs w:val="22"/>
               </w:rPr>
@@ -3617,9 +4117,10 @@
           <w:p>
             <w:r>
               <w:rPr>
-                <w:b w:val="false"/>
-                <w:bCs w:val="false"/>
-                <w:color w:val="000000"/>
+                <w:rFonts w:ascii="Calibri" w:cs="Calibri" w:eastAsia="Calibri" w:hAnsi="Calibri"/>
+                <w:b w:val="false"/>
+                <w:bCs w:val="false"/>
+                <w:color w:val="333333"/>
                 <w:sz w:val="22"/>
                 <w:szCs w:val="22"/>
               </w:rPr>
@@ -3636,9 +4137,10 @@
           <w:p>
             <w:r>
               <w:rPr>
-                <w:b/>
-                <w:bCs/>
-                <w:color w:val="000000"/>
+                <w:rFonts w:ascii="Calibri" w:cs="Calibri" w:eastAsia="Calibri" w:hAnsi="Calibri"/>
+                <w:b/>
+                <w:bCs/>
+                <w:color w:val="333333"/>
                 <w:sz w:val="22"/>
                 <w:szCs w:val="22"/>
               </w:rPr>
@@ -3653,9 +4155,10 @@
           <w:p>
             <w:r>
               <w:rPr>
-                <w:b w:val="false"/>
-                <w:bCs w:val="false"/>
-                <w:color w:val="000000"/>
+                <w:rFonts w:ascii="Calibri" w:cs="Calibri" w:eastAsia="Calibri" w:hAnsi="Calibri"/>
+                <w:b w:val="false"/>
+                <w:bCs w:val="false"/>
+                <w:color w:val="333333"/>
                 <w:sz w:val="22"/>
                 <w:szCs w:val="22"/>
               </w:rPr>
@@ -3672,9 +4175,10 @@
           <w:p>
             <w:r>
               <w:rPr>
-                <w:b/>
-                <w:bCs/>
-                <w:color w:val="000000"/>
+                <w:rFonts w:ascii="Calibri" w:cs="Calibri" w:eastAsia="Calibri" w:hAnsi="Calibri"/>
+                <w:b/>
+                <w:bCs/>
+                <w:color w:val="333333"/>
                 <w:sz w:val="22"/>
                 <w:szCs w:val="22"/>
               </w:rPr>
@@ -3689,9 +4193,10 @@
           <w:p>
             <w:r>
               <w:rPr>
-                <w:b w:val="false"/>
-                <w:bCs w:val="false"/>
-                <w:color w:val="000000"/>
+                <w:rFonts w:ascii="Calibri" w:cs="Calibri" w:eastAsia="Calibri" w:hAnsi="Calibri"/>
+                <w:b w:val="false"/>
+                <w:bCs w:val="false"/>
+                <w:color w:val="333333"/>
                 <w:sz w:val="22"/>
                 <w:szCs w:val="22"/>
               </w:rPr>
@@ -3731,6 +4236,7 @@
           <w:p>
             <w:r>
               <w:rPr>
+                <w:rFonts w:ascii="Calibri" w:cs="Calibri" w:eastAsia="Calibri" w:hAnsi="Calibri"/>
                 <w:b/>
                 <w:bCs/>
                 <w:color w:val="FFFFFF"/>
@@ -3749,6 +4255,7 @@
           <w:p>
             <w:r>
               <w:rPr>
+                <w:rFonts w:ascii="Calibri" w:cs="Calibri" w:eastAsia="Calibri" w:hAnsi="Calibri"/>
                 <w:b/>
                 <w:bCs/>
                 <w:color w:val="FFFFFF"/>
@@ -3768,9 +4275,10 @@
           <w:p>
             <w:r>
               <w:rPr>
-                <w:b/>
-                <w:bCs/>
-                <w:color w:val="000000"/>
+                <w:rFonts w:ascii="Calibri" w:cs="Calibri" w:eastAsia="Calibri" w:hAnsi="Calibri"/>
+                <w:b/>
+                <w:bCs/>
+                <w:color w:val="333333"/>
                 <w:sz w:val="22"/>
                 <w:szCs w:val="22"/>
               </w:rPr>
@@ -3785,9 +4293,10 @@
           <w:p>
             <w:r>
               <w:rPr>
-                <w:b w:val="false"/>
-                <w:bCs w:val="false"/>
-                <w:color w:val="000000"/>
+                <w:rFonts w:ascii="Calibri" w:cs="Calibri" w:eastAsia="Calibri" w:hAnsi="Calibri"/>
+                <w:b w:val="false"/>
+                <w:bCs w:val="false"/>
+                <w:color w:val="333333"/>
                 <w:sz w:val="22"/>
                 <w:szCs w:val="22"/>
               </w:rPr>
@@ -3804,9 +4313,10 @@
           <w:p>
             <w:r>
               <w:rPr>
-                <w:b/>
-                <w:bCs/>
-                <w:color w:val="000000"/>
+                <w:rFonts w:ascii="Calibri" w:cs="Calibri" w:eastAsia="Calibri" w:hAnsi="Calibri"/>
+                <w:b/>
+                <w:bCs/>
+                <w:color w:val="333333"/>
                 <w:sz w:val="22"/>
                 <w:szCs w:val="22"/>
               </w:rPr>
@@ -3821,9 +4331,10 @@
           <w:p>
             <w:r>
               <w:rPr>
-                <w:b w:val="false"/>
-                <w:bCs w:val="false"/>
-                <w:color w:val="000000"/>
+                <w:rFonts w:ascii="Calibri" w:cs="Calibri" w:eastAsia="Calibri" w:hAnsi="Calibri"/>
+                <w:b w:val="false"/>
+                <w:bCs w:val="false"/>
+                <w:color w:val="333333"/>
                 <w:sz w:val="22"/>
                 <w:szCs w:val="22"/>
               </w:rPr>
@@ -3840,9 +4351,10 @@
           <w:p>
             <w:r>
               <w:rPr>
-                <w:b/>
-                <w:bCs/>
-                <w:color w:val="000000"/>
+                <w:rFonts w:ascii="Calibri" w:cs="Calibri" w:eastAsia="Calibri" w:hAnsi="Calibri"/>
+                <w:b/>
+                <w:bCs/>
+                <w:color w:val="333333"/>
                 <w:sz w:val="22"/>
                 <w:szCs w:val="22"/>
               </w:rPr>
@@ -3857,9 +4369,10 @@
           <w:p>
             <w:r>
               <w:rPr>
-                <w:b w:val="false"/>
-                <w:bCs w:val="false"/>
-                <w:color w:val="000000"/>
+                <w:rFonts w:ascii="Calibri" w:cs="Calibri" w:eastAsia="Calibri" w:hAnsi="Calibri"/>
+                <w:b w:val="false"/>
+                <w:bCs w:val="false"/>
+                <w:color w:val="333333"/>
                 <w:sz w:val="22"/>
                 <w:szCs w:val="22"/>
               </w:rPr>
@@ -3876,9 +4389,10 @@
           <w:p>
             <w:r>
               <w:rPr>
-                <w:b/>
-                <w:bCs/>
-                <w:color w:val="000000"/>
+                <w:rFonts w:ascii="Calibri" w:cs="Calibri" w:eastAsia="Calibri" w:hAnsi="Calibri"/>
+                <w:b/>
+                <w:bCs/>
+                <w:color w:val="333333"/>
                 <w:sz w:val="22"/>
                 <w:szCs w:val="22"/>
               </w:rPr>
@@ -3893,9 +4407,10 @@
           <w:p>
             <w:r>
               <w:rPr>
-                <w:b w:val="false"/>
-                <w:bCs w:val="false"/>
-                <w:color w:val="000000"/>
+                <w:rFonts w:ascii="Calibri" w:cs="Calibri" w:eastAsia="Calibri" w:hAnsi="Calibri"/>
+                <w:b w:val="false"/>
+                <w:bCs w:val="false"/>
+                <w:color w:val="333333"/>
                 <w:sz w:val="22"/>
                 <w:szCs w:val="22"/>
               </w:rPr>
@@ -3912,9 +4427,10 @@
           <w:p>
             <w:r>
               <w:rPr>
-                <w:b/>
-                <w:bCs/>
-                <w:color w:val="000000"/>
+                <w:rFonts w:ascii="Calibri" w:cs="Calibri" w:eastAsia="Calibri" w:hAnsi="Calibri"/>
+                <w:b/>
+                <w:bCs/>
+                <w:color w:val="333333"/>
                 <w:sz w:val="22"/>
                 <w:szCs w:val="22"/>
               </w:rPr>
@@ -3929,9 +4445,10 @@
           <w:p>
             <w:r>
               <w:rPr>
-                <w:b w:val="false"/>
-                <w:bCs w:val="false"/>
-                <w:color w:val="000000"/>
+                <w:rFonts w:ascii="Calibri" w:cs="Calibri" w:eastAsia="Calibri" w:hAnsi="Calibri"/>
+                <w:b w:val="false"/>
+                <w:bCs w:val="false"/>
+                <w:color w:val="333333"/>
                 <w:sz w:val="22"/>
                 <w:szCs w:val="22"/>
               </w:rPr>
@@ -3948,9 +4465,10 @@
           <w:p>
             <w:r>
               <w:rPr>
-                <w:b/>
-                <w:bCs/>
-                <w:color w:val="000000"/>
+                <w:rFonts w:ascii="Calibri" w:cs="Calibri" w:eastAsia="Calibri" w:hAnsi="Calibri"/>
+                <w:b/>
+                <w:bCs/>
+                <w:color w:val="333333"/>
                 <w:sz w:val="22"/>
                 <w:szCs w:val="22"/>
               </w:rPr>
@@ -3965,9 +4483,10 @@
           <w:p>
             <w:r>
               <w:rPr>
-                <w:b w:val="false"/>
-                <w:bCs w:val="false"/>
-                <w:color w:val="000000"/>
+                <w:rFonts w:ascii="Calibri" w:cs="Calibri" w:eastAsia="Calibri" w:hAnsi="Calibri"/>
+                <w:b w:val="false"/>
+                <w:bCs w:val="false"/>
+                <w:color w:val="333333"/>
                 <w:sz w:val="22"/>
                 <w:szCs w:val="22"/>
               </w:rPr>
@@ -4007,6 +4526,7 @@
           <w:p>
             <w:r>
               <w:rPr>
+                <w:rFonts w:ascii="Calibri" w:cs="Calibri" w:eastAsia="Calibri" w:hAnsi="Calibri"/>
                 <w:b/>
                 <w:bCs/>
                 <w:color w:val="FFFFFF"/>
@@ -4025,6 +4545,7 @@
           <w:p>
             <w:r>
               <w:rPr>
+                <w:rFonts w:ascii="Calibri" w:cs="Calibri" w:eastAsia="Calibri" w:hAnsi="Calibri"/>
                 <w:b/>
                 <w:bCs/>
                 <w:color w:val="FFFFFF"/>
@@ -4044,9 +4565,10 @@
           <w:p>
             <w:r>
               <w:rPr>
-                <w:b/>
-                <w:bCs/>
-                <w:color w:val="000000"/>
+                <w:rFonts w:ascii="Calibri" w:cs="Calibri" w:eastAsia="Calibri" w:hAnsi="Calibri"/>
+                <w:b/>
+                <w:bCs/>
+                <w:color w:val="333333"/>
                 <w:sz w:val="22"/>
                 <w:szCs w:val="22"/>
               </w:rPr>
@@ -4061,9 +4583,10 @@
           <w:p>
             <w:r>
               <w:rPr>
-                <w:b w:val="false"/>
-                <w:bCs w:val="false"/>
-                <w:color w:val="000000"/>
+                <w:rFonts w:ascii="Calibri" w:cs="Calibri" w:eastAsia="Calibri" w:hAnsi="Calibri"/>
+                <w:b w:val="false"/>
+                <w:bCs w:val="false"/>
+                <w:color w:val="333333"/>
                 <w:sz w:val="22"/>
                 <w:szCs w:val="22"/>
               </w:rPr>
@@ -4080,9 +4603,10 @@
           <w:p>
             <w:r>
               <w:rPr>
-                <w:b/>
-                <w:bCs/>
-                <w:color w:val="000000"/>
+                <w:rFonts w:ascii="Calibri" w:cs="Calibri" w:eastAsia="Calibri" w:hAnsi="Calibri"/>
+                <w:b/>
+                <w:bCs/>
+                <w:color w:val="333333"/>
                 <w:sz w:val="22"/>
                 <w:szCs w:val="22"/>
               </w:rPr>
@@ -4097,9 +4621,10 @@
           <w:p>
             <w:r>
               <w:rPr>
-                <w:b w:val="false"/>
-                <w:bCs w:val="false"/>
-                <w:color w:val="000000"/>
+                <w:rFonts w:ascii="Calibri" w:cs="Calibri" w:eastAsia="Calibri" w:hAnsi="Calibri"/>
+                <w:b w:val="false"/>
+                <w:bCs w:val="false"/>
+                <w:color w:val="333333"/>
                 <w:sz w:val="22"/>
                 <w:szCs w:val="22"/>
               </w:rPr>
@@ -4116,9 +4641,10 @@
           <w:p>
             <w:r>
               <w:rPr>
-                <w:b/>
-                <w:bCs/>
-                <w:color w:val="000000"/>
+                <w:rFonts w:ascii="Calibri" w:cs="Calibri" w:eastAsia="Calibri" w:hAnsi="Calibri"/>
+                <w:b/>
+                <w:bCs/>
+                <w:color w:val="333333"/>
                 <w:sz w:val="22"/>
                 <w:szCs w:val="22"/>
               </w:rPr>
@@ -4133,9 +4659,10 @@
           <w:p>
             <w:r>
               <w:rPr>
-                <w:b w:val="false"/>
-                <w:bCs w:val="false"/>
-                <w:color w:val="000000"/>
+                <w:rFonts w:ascii="Calibri" w:cs="Calibri" w:eastAsia="Calibri" w:hAnsi="Calibri"/>
+                <w:b w:val="false"/>
+                <w:bCs w:val="false"/>
+                <w:color w:val="333333"/>
                 <w:sz w:val="22"/>
                 <w:szCs w:val="22"/>
               </w:rPr>
@@ -4152,9 +4679,10 @@
           <w:p>
             <w:r>
               <w:rPr>
-                <w:b/>
-                <w:bCs/>
-                <w:color w:val="000000"/>
+                <w:rFonts w:ascii="Calibri" w:cs="Calibri" w:eastAsia="Calibri" w:hAnsi="Calibri"/>
+                <w:b/>
+                <w:bCs/>
+                <w:color w:val="333333"/>
                 <w:sz w:val="22"/>
                 <w:szCs w:val="22"/>
               </w:rPr>
@@ -4169,9 +4697,10 @@
           <w:p>
             <w:r>
               <w:rPr>
-                <w:b w:val="false"/>
-                <w:bCs w:val="false"/>
-                <w:color w:val="000000"/>
+                <w:rFonts w:ascii="Calibri" w:cs="Calibri" w:eastAsia="Calibri" w:hAnsi="Calibri"/>
+                <w:b w:val="false"/>
+                <w:bCs w:val="false"/>
+                <w:color w:val="333333"/>
                 <w:sz w:val="22"/>
                 <w:szCs w:val="22"/>
               </w:rPr>
@@ -4188,9 +4717,10 @@
           <w:p>
             <w:r>
               <w:rPr>
-                <w:b/>
-                <w:bCs/>
-                <w:color w:val="000000"/>
+                <w:rFonts w:ascii="Calibri" w:cs="Calibri" w:eastAsia="Calibri" w:hAnsi="Calibri"/>
+                <w:b/>
+                <w:bCs/>
+                <w:color w:val="333333"/>
                 <w:sz w:val="22"/>
                 <w:szCs w:val="22"/>
               </w:rPr>
@@ -4205,9 +4735,10 @@
           <w:p>
             <w:r>
               <w:rPr>
-                <w:b w:val="false"/>
-                <w:bCs w:val="false"/>
-                <w:color w:val="000000"/>
+                <w:rFonts w:ascii="Calibri" w:cs="Calibri" w:eastAsia="Calibri" w:hAnsi="Calibri"/>
+                <w:b w:val="false"/>
+                <w:bCs w:val="false"/>
+                <w:color w:val="333333"/>
                 <w:sz w:val="22"/>
                 <w:szCs w:val="22"/>
               </w:rPr>
@@ -4224,9 +4755,10 @@
           <w:p>
             <w:r>
               <w:rPr>
-                <w:b/>
-                <w:bCs/>
-                <w:color w:val="000000"/>
+                <w:rFonts w:ascii="Calibri" w:cs="Calibri" w:eastAsia="Calibri" w:hAnsi="Calibri"/>
+                <w:b/>
+                <w:bCs/>
+                <w:color w:val="333333"/>
                 <w:sz w:val="22"/>
                 <w:szCs w:val="22"/>
               </w:rPr>
@@ -4241,9 +4773,10 @@
           <w:p>
             <w:r>
               <w:rPr>
-                <w:b w:val="false"/>
-                <w:bCs w:val="false"/>
-                <w:color w:val="000000"/>
+                <w:rFonts w:ascii="Calibri" w:cs="Calibri" w:eastAsia="Calibri" w:hAnsi="Calibri"/>
+                <w:b w:val="false"/>
+                <w:bCs w:val="false"/>
+                <w:color w:val="333333"/>
                 <w:sz w:val="22"/>
                 <w:szCs w:val="22"/>
               </w:rPr>
@@ -4283,6 +4816,7 @@
           <w:p>
             <w:r>
               <w:rPr>
+                <w:rFonts w:ascii="Calibri" w:cs="Calibri" w:eastAsia="Calibri" w:hAnsi="Calibri"/>
                 <w:b/>
                 <w:bCs/>
                 <w:color w:val="FFFFFF"/>
@@ -4301,6 +4835,7 @@
           <w:p>
             <w:r>
               <w:rPr>
+                <w:rFonts w:ascii="Calibri" w:cs="Calibri" w:eastAsia="Calibri" w:hAnsi="Calibri"/>
                 <w:b/>
                 <w:bCs/>
                 <w:color w:val="FFFFFF"/>
@@ -4320,9 +4855,10 @@
           <w:p>
             <w:r>
               <w:rPr>
-                <w:b/>
-                <w:bCs/>
-                <w:color w:val="000000"/>
+                <w:rFonts w:ascii="Calibri" w:cs="Calibri" w:eastAsia="Calibri" w:hAnsi="Calibri"/>
+                <w:b/>
+                <w:bCs/>
+                <w:color w:val="333333"/>
                 <w:sz w:val="22"/>
                 <w:szCs w:val="22"/>
               </w:rPr>
@@ -4337,9 +4873,10 @@
           <w:p>
             <w:r>
               <w:rPr>
-                <w:b w:val="false"/>
-                <w:bCs w:val="false"/>
-                <w:color w:val="000000"/>
+                <w:rFonts w:ascii="Calibri" w:cs="Calibri" w:eastAsia="Calibri" w:hAnsi="Calibri"/>
+                <w:b w:val="false"/>
+                <w:bCs w:val="false"/>
+                <w:color w:val="333333"/>
                 <w:sz w:val="22"/>
                 <w:szCs w:val="22"/>
               </w:rPr>
@@ -4356,9 +4893,10 @@
           <w:p>
             <w:r>
               <w:rPr>
-                <w:b/>
-                <w:bCs/>
-                <w:color w:val="000000"/>
+                <w:rFonts w:ascii="Calibri" w:cs="Calibri" w:eastAsia="Calibri" w:hAnsi="Calibri"/>
+                <w:b/>
+                <w:bCs/>
+                <w:color w:val="333333"/>
                 <w:sz w:val="22"/>
                 <w:szCs w:val="22"/>
               </w:rPr>
@@ -4373,9 +4911,10 @@
           <w:p>
             <w:r>
               <w:rPr>
-                <w:b w:val="false"/>
-                <w:bCs w:val="false"/>
-                <w:color w:val="000000"/>
+                <w:rFonts w:ascii="Calibri" w:cs="Calibri" w:eastAsia="Calibri" w:hAnsi="Calibri"/>
+                <w:b w:val="false"/>
+                <w:bCs w:val="false"/>
+                <w:color w:val="333333"/>
                 <w:sz w:val="22"/>
                 <w:szCs w:val="22"/>
               </w:rPr>
@@ -4392,9 +4931,10 @@
           <w:p>
             <w:r>
               <w:rPr>
-                <w:b/>
-                <w:bCs/>
-                <w:color w:val="000000"/>
+                <w:rFonts w:ascii="Calibri" w:cs="Calibri" w:eastAsia="Calibri" w:hAnsi="Calibri"/>
+                <w:b/>
+                <w:bCs/>
+                <w:color w:val="333333"/>
                 <w:sz w:val="22"/>
                 <w:szCs w:val="22"/>
               </w:rPr>
@@ -4409,9 +4949,10 @@
           <w:p>
             <w:r>
               <w:rPr>
-                <w:b w:val="false"/>
-                <w:bCs w:val="false"/>
-                <w:color w:val="000000"/>
+                <w:rFonts w:ascii="Calibri" w:cs="Calibri" w:eastAsia="Calibri" w:hAnsi="Calibri"/>
+                <w:b w:val="false"/>
+                <w:bCs w:val="false"/>
+                <w:color w:val="333333"/>
                 <w:sz w:val="22"/>
                 <w:szCs w:val="22"/>
               </w:rPr>
@@ -4428,9 +4969,10 @@
           <w:p>
             <w:r>
               <w:rPr>
-                <w:b/>
-                <w:bCs/>
-                <w:color w:val="000000"/>
+                <w:rFonts w:ascii="Calibri" w:cs="Calibri" w:eastAsia="Calibri" w:hAnsi="Calibri"/>
+                <w:b/>
+                <w:bCs/>
+                <w:color w:val="333333"/>
                 <w:sz w:val="22"/>
                 <w:szCs w:val="22"/>
               </w:rPr>
@@ -4445,9 +4987,10 @@
           <w:p>
             <w:r>
               <w:rPr>
-                <w:b w:val="false"/>
-                <w:bCs w:val="false"/>
-                <w:color w:val="000000"/>
+                <w:rFonts w:ascii="Calibri" w:cs="Calibri" w:eastAsia="Calibri" w:hAnsi="Calibri"/>
+                <w:b w:val="false"/>
+                <w:bCs w:val="false"/>
+                <w:color w:val="333333"/>
                 <w:sz w:val="22"/>
                 <w:szCs w:val="22"/>
               </w:rPr>
@@ -4464,9 +5007,10 @@
           <w:p>
             <w:r>
               <w:rPr>
-                <w:b/>
-                <w:bCs/>
-                <w:color w:val="000000"/>
+                <w:rFonts w:ascii="Calibri" w:cs="Calibri" w:eastAsia="Calibri" w:hAnsi="Calibri"/>
+                <w:b/>
+                <w:bCs/>
+                <w:color w:val="333333"/>
                 <w:sz w:val="22"/>
                 <w:szCs w:val="22"/>
               </w:rPr>
@@ -4481,9 +5025,10 @@
           <w:p>
             <w:r>
               <w:rPr>
-                <w:b w:val="false"/>
-                <w:bCs w:val="false"/>
-                <w:color w:val="000000"/>
+                <w:rFonts w:ascii="Calibri" w:cs="Calibri" w:eastAsia="Calibri" w:hAnsi="Calibri"/>
+                <w:b w:val="false"/>
+                <w:bCs w:val="false"/>
+                <w:color w:val="333333"/>
                 <w:sz w:val="22"/>
                 <w:szCs w:val="22"/>
               </w:rPr>
@@ -4500,9 +5045,10 @@
           <w:p>
             <w:r>
               <w:rPr>
-                <w:b/>
-                <w:bCs/>
-                <w:color w:val="000000"/>
+                <w:rFonts w:ascii="Calibri" w:cs="Calibri" w:eastAsia="Calibri" w:hAnsi="Calibri"/>
+                <w:b/>
+                <w:bCs/>
+                <w:color w:val="333333"/>
                 <w:sz w:val="22"/>
                 <w:szCs w:val="22"/>
               </w:rPr>
@@ -4517,9 +5063,10 @@
           <w:p>
             <w:r>
               <w:rPr>
-                <w:b w:val="false"/>
-                <w:bCs w:val="false"/>
-                <w:color w:val="000000"/>
+                <w:rFonts w:ascii="Calibri" w:cs="Calibri" w:eastAsia="Calibri" w:hAnsi="Calibri"/>
+                <w:b w:val="false"/>
+                <w:bCs w:val="false"/>
+                <w:color w:val="333333"/>
                 <w:sz w:val="22"/>
                 <w:szCs w:val="22"/>
               </w:rPr>
@@ -4533,6 +5080,327 @@
       <w:pPr>
         <w:spacing w:after="200"/>
       </w:pPr>
+    </w:p>
+    <w:p>
+      <w:r>
+        <w:br w:type="page"/>
+      </w:r>
+    </w:p>
+    <w:p>
+      <w:pPr>
+        <w:spacing w:after="300" w:before="200"/>
+      </w:pPr>
+      <w:r>
+        <w:rPr>
+          <w:rFonts w:ascii="Calibri" w:cs="Calibri" w:eastAsia="Calibri" w:hAnsi="Calibri"/>
+          <w:b/>
+          <w:bCs/>
+          <w:color w:val="0b253e"/>
+          <w:sz w:val="28"/>
+          <w:szCs w:val="28"/>
+        </w:rPr>
+        <w:t xml:space="preserve">3. Perguntas Frequentes (FAQ)</w:t>
+      </w:r>
+    </w:p>
+    <w:p>
+      <w:pPr>
+        <w:spacing w:after="100" w:before="200"/>
+      </w:pPr>
+      <w:r>
+        <w:rPr>
+          <w:rFonts w:ascii="Calibri" w:cs="Calibri" w:eastAsia="Calibri" w:hAnsi="Calibri"/>
+          <w:b/>
+          <w:bCs/>
+          <w:color w:val="0b253e"/>
+          <w:sz w:val="24"/>
+          <w:szCs w:val="24"/>
+        </w:rPr>
+        <w:t xml:space="preserve">1. O que é o SCAC?</w:t>
+      </w:r>
+    </w:p>
+    <w:p>
+      <w:pPr>
+        <w:spacing w:after="200"/>
+      </w:pPr>
+      <w:r>
+        <w:rPr>
+          <w:rFonts w:ascii="Calibri" w:cs="Calibri" w:eastAsia="Calibri" w:hAnsi="Calibri"/>
+          <w:color w:val="333333"/>
+          <w:sz w:val="22"/>
+          <w:szCs w:val="22"/>
+        </w:rPr>
+        <w:t xml:space="preserve">O SCAC (Sistema de Compartilhamento de Arquivos Confidenciais) é uma plataforma segura desenvolvida para permitir o compartilhamento controlado de documentos confidenciais com usuários externos autorizados, garantindo rastreabilidade, auditoria e conformidade com as políticas de segurança da Petrobras.</w:t>
+      </w:r>
+    </w:p>
+    <w:p>
+      <w:pPr>
+        <w:spacing w:after="100" w:before="200"/>
+      </w:pPr>
+      <w:r>
+        <w:rPr>
+          <w:rFonts w:ascii="Calibri" w:cs="Calibri" w:eastAsia="Calibri" w:hAnsi="Calibri"/>
+          <w:b/>
+          <w:bCs/>
+          <w:color w:val="0b253e"/>
+          <w:sz w:val="24"/>
+          <w:szCs w:val="24"/>
+        </w:rPr>
+        <w:t xml:space="preserve">2. Quem pode utilizar o sistema?</w:t>
+      </w:r>
+    </w:p>
+    <w:p>
+      <w:pPr>
+        <w:spacing w:after="200"/>
+      </w:pPr>
+      <w:r>
+        <w:rPr>
+          <w:rFonts w:ascii="Calibri" w:cs="Calibri" w:eastAsia="Calibri" w:hAnsi="Calibri"/>
+          <w:color w:val="333333"/>
+          <w:sz w:val="22"/>
+          <w:szCs w:val="22"/>
+        </w:rPr>
+        <w:t xml:space="preserve">O sistema possui quatro perfis de usuário: Usuário Interno (funcionários que iniciam compartilhamentos), Supervisor (responsável por aprovar solicitações), Usuário Externo (destinatário que recebe os arquivos) e Administrador (responsável por auditoria e monitoramento).</w:t>
+      </w:r>
+    </w:p>
+    <w:p>
+      <w:pPr>
+        <w:spacing w:after="100" w:before="200"/>
+      </w:pPr>
+      <w:r>
+        <w:rPr>
+          <w:rFonts w:ascii="Calibri" w:cs="Calibri" w:eastAsia="Calibri" w:hAnsi="Calibri"/>
+          <w:b/>
+          <w:bCs/>
+          <w:color w:val="0b253e"/>
+          <w:sz w:val="24"/>
+          <w:szCs w:val="24"/>
+        </w:rPr>
+        <w:t xml:space="preserve">3. Como funciona a autenticação para usuários internos?</w:t>
+      </w:r>
+    </w:p>
+    <w:p>
+      <w:pPr>
+        <w:spacing w:after="200"/>
+      </w:pPr>
+      <w:r>
+        <w:rPr>
+          <w:rFonts w:ascii="Calibri" w:cs="Calibri" w:eastAsia="Calibri" w:hAnsi="Calibri"/>
+          <w:color w:val="333333"/>
+          <w:sz w:val="22"/>
+          <w:szCs w:val="22"/>
+        </w:rPr>
+        <w:t xml:space="preserve">Usuários internos (funcionários Petrobras) realizam autenticação através do Entra ID (Microsoft), utilizando suas credenciais corporativas. O sistema valida automaticamente as permissões baseadas nos grupos do diretório corporativo.</w:t>
+      </w:r>
+    </w:p>
+    <w:p>
+      <w:pPr>
+        <w:spacing w:after="100" w:before="200"/>
+      </w:pPr>
+      <w:r>
+        <w:rPr>
+          <w:rFonts w:ascii="Calibri" w:cs="Calibri" w:eastAsia="Calibri" w:hAnsi="Calibri"/>
+          <w:b/>
+          <w:bCs/>
+          <w:color w:val="0b253e"/>
+          <w:sz w:val="24"/>
+          <w:szCs w:val="24"/>
+        </w:rPr>
+        <w:t xml:space="preserve">4. Como o usuário externo acessa os arquivos?</w:t>
+      </w:r>
+    </w:p>
+    <w:p>
+      <w:pPr>
+        <w:spacing w:after="200"/>
+      </w:pPr>
+      <w:r>
+        <w:rPr>
+          <w:rFonts w:ascii="Calibri" w:cs="Calibri" w:eastAsia="Calibri" w:hAnsi="Calibri"/>
+          <w:color w:val="333333"/>
+          <w:sz w:val="22"/>
+          <w:szCs w:val="22"/>
+        </w:rPr>
+        <w:t xml:space="preserve">O usuário externo recebe um link seguro por e-mail. Ao clicar, é direcionado para uma página de autenticação onde deve informar um código OTP (One-Time Password) enviado para seu e-mail cadastrado. Após validação, os arquivos ficam disponíveis para download.</w:t>
+      </w:r>
+    </w:p>
+    <w:p>
+      <w:pPr>
+        <w:spacing w:after="100" w:before="200"/>
+      </w:pPr>
+      <w:r>
+        <w:rPr>
+          <w:rFonts w:ascii="Calibri" w:cs="Calibri" w:eastAsia="Calibri" w:hAnsi="Calibri"/>
+          <w:b/>
+          <w:bCs/>
+          <w:color w:val="0b253e"/>
+          <w:sz w:val="24"/>
+          <w:szCs w:val="24"/>
+        </w:rPr>
+        <w:t xml:space="preserve">5. Por quanto tempo o link de compartilhamento fica válido?</w:t>
+      </w:r>
+    </w:p>
+    <w:p>
+      <w:pPr>
+        <w:spacing w:after="200"/>
+      </w:pPr>
+      <w:r>
+        <w:rPr>
+          <w:rFonts w:ascii="Calibri" w:cs="Calibri" w:eastAsia="Calibri" w:hAnsi="Calibri"/>
+          <w:color w:val="333333"/>
+          <w:sz w:val="22"/>
+          <w:szCs w:val="22"/>
+        </w:rPr>
+        <w:t xml:space="preserve">O período de validade é definido pelo usuário interno no momento da criação da solicitação. Após expirar, o link torna-se inválido e o usuário externo não conseguirá mais acessar os arquivos.</w:t>
+      </w:r>
+    </w:p>
+    <w:p>
+      <w:pPr>
+        <w:spacing w:after="100" w:before="200"/>
+      </w:pPr>
+      <w:r>
+        <w:rPr>
+          <w:rFonts w:ascii="Calibri" w:cs="Calibri" w:eastAsia="Calibri" w:hAnsi="Calibri"/>
+          <w:b/>
+          <w:bCs/>
+          <w:color w:val="0b253e"/>
+          <w:sz w:val="24"/>
+          <w:szCs w:val="24"/>
+        </w:rPr>
+        <w:t xml:space="preserve">6. O Supervisor precisa aprovar todos os compartilhamentos?</w:t>
+      </w:r>
+    </w:p>
+    <w:p>
+      <w:pPr>
+        <w:spacing w:after="200"/>
+      </w:pPr>
+      <w:r>
+        <w:rPr>
+          <w:rFonts w:ascii="Calibri" w:cs="Calibri" w:eastAsia="Calibri" w:hAnsi="Calibri"/>
+          <w:color w:val="333333"/>
+          <w:sz w:val="22"/>
+          <w:szCs w:val="22"/>
+        </w:rPr>
+        <w:t xml:space="preserve">Sim, todas as solicitações criadas por usuários internos passam por aprovação do Supervisor. Porém, quando o próprio Supervisor realiza um compartilhamento direto, não é necessária aprovação adicional.</w:t>
+      </w:r>
+    </w:p>
+    <w:p>
+      <w:pPr>
+        <w:spacing w:after="100" w:before="200"/>
+      </w:pPr>
+      <w:r>
+        <w:rPr>
+          <w:rFonts w:ascii="Calibri" w:cs="Calibri" w:eastAsia="Calibri" w:hAnsi="Calibri"/>
+          <w:b/>
+          <w:bCs/>
+          <w:color w:val="0b253e"/>
+          <w:sz w:val="24"/>
+          <w:szCs w:val="24"/>
+        </w:rPr>
+        <w:t xml:space="preserve">7. O sistema registra todas as atividades?</w:t>
+      </w:r>
+    </w:p>
+    <w:p>
+      <w:pPr>
+        <w:spacing w:after="200"/>
+      </w:pPr>
+      <w:r>
+        <w:rPr>
+          <w:rFonts w:ascii="Calibri" w:cs="Calibri" w:eastAsia="Calibri" w:hAnsi="Calibri"/>
+          <w:color w:val="333333"/>
+          <w:sz w:val="22"/>
+          <w:szCs w:val="22"/>
+        </w:rPr>
+        <w:t xml:space="preserve">Sim. O SCAC possui recursos completos de auditoria e rastreabilidade. Todas as ações são registradas, incluindo: criação de solicitações, uploads, aprovações, rejeições, acessos externos e downloads. O Administrador pode consultar esses logs a qualquer momento.</w:t>
+      </w:r>
+    </w:p>
+    <w:p>
+      <w:pPr>
+        <w:spacing w:after="100" w:before="200"/>
+      </w:pPr>
+      <w:r>
+        <w:rPr>
+          <w:rFonts w:ascii="Calibri" w:cs="Calibri" w:eastAsia="Calibri" w:hAnsi="Calibri"/>
+          <w:b/>
+          <w:bCs/>
+          <w:color w:val="0b253e"/>
+          <w:sz w:val="24"/>
+          <w:szCs w:val="24"/>
+        </w:rPr>
+        <w:t xml:space="preserve">8. Quais relatórios estão disponíveis?</w:t>
+      </w:r>
+    </w:p>
+    <w:p>
+      <w:pPr>
+        <w:spacing w:after="200"/>
+      </w:pPr>
+      <w:r>
+        <w:rPr>
+          <w:rFonts w:ascii="Calibri" w:cs="Calibri" w:eastAsia="Calibri" w:hAnsi="Calibri"/>
+          <w:color w:val="333333"/>
+          <w:sz w:val="22"/>
+          <w:szCs w:val="22"/>
+        </w:rPr>
+        <w:t xml:space="preserve">O sistema oferece relatórios de compartilhamentos realizados, acessos externos, histórico de aprovações e análise de inconsistências. Os relatórios podem ser exportados em formato PDF ou Excel.</w:t>
+      </w:r>
+    </w:p>
+    <w:p>
+      <w:pPr>
+        <w:spacing w:after="100" w:before="200"/>
+      </w:pPr>
+      <w:r>
+        <w:rPr>
+          <w:rFonts w:ascii="Calibri" w:cs="Calibri" w:eastAsia="Calibri" w:hAnsi="Calibri"/>
+          <w:b/>
+          <w:bCs/>
+          <w:color w:val="0b253e"/>
+          <w:sz w:val="24"/>
+          <w:szCs w:val="24"/>
+        </w:rPr>
+        <w:t xml:space="preserve">9. O que acontece se minha solicitação for rejeitada?</w:t>
+      </w:r>
+    </w:p>
+    <w:p>
+      <w:pPr>
+        <w:spacing w:after="200"/>
+      </w:pPr>
+      <w:r>
+        <w:rPr>
+          <w:rFonts w:ascii="Calibri" w:cs="Calibri" w:eastAsia="Calibri" w:hAnsi="Calibri"/>
+          <w:color w:val="333333"/>
+          <w:sz w:val="22"/>
+          <w:szCs w:val="22"/>
+        </w:rPr>
+        <w:t xml:space="preserve">Quando o Supervisor rejeita uma solicitação, o usuário interno que a criou recebe uma notificação com a justificativa da rejeição. O usuário pode então criar uma nova solicitação corrigindo os pontos indicados.</w:t>
+      </w:r>
+    </w:p>
+    <w:p>
+      <w:pPr>
+        <w:spacing w:after="100" w:before="200"/>
+      </w:pPr>
+      <w:r>
+        <w:rPr>
+          <w:rFonts w:ascii="Calibri" w:cs="Calibri" w:eastAsia="Calibri" w:hAnsi="Calibri"/>
+          <w:b/>
+          <w:bCs/>
+          <w:color w:val="0b253e"/>
+          <w:sz w:val="24"/>
+          <w:szCs w:val="24"/>
+        </w:rPr>
+        <w:t xml:space="preserve">10. Qual infraestrutura é utilizada pelo sistema?</w:t>
+      </w:r>
+    </w:p>
+    <w:p>
+      <w:pPr>
+        <w:spacing w:after="200"/>
+      </w:pPr>
+      <w:r>
+        <w:rPr>
+          <w:rFonts w:ascii="Calibri" w:cs="Calibri" w:eastAsia="Calibri" w:hAnsi="Calibri"/>
+          <w:color w:val="333333"/>
+          <w:sz w:val="22"/>
+          <w:szCs w:val="22"/>
+        </w:rPr>
+        <w:t xml:space="preserve">O SCAC utiliza infraestrutura em nuvem AWS com arquitetura containerizada por Amazon ECS, garantindo alta disponibilidade, escalabilidade e segurança dos dados.</w:t>
+      </w:r>
     </w:p>
     <w:sectPr>
       <w:pgSz w:w="11906" w:h="16838" w:orient="portrait"/>

</xml_diff>